<commit_message>
Auto sync 2026-10-26 11:11:13
</commit_message>
<xml_diff>
--- a/04-需求管理/PRD-OMS拉取旺店通拆合单数据-v1.0.docx
+++ b/04-需求管理/PRD-OMS拉取旺店通拆合单数据-v1.0.docx
@@ -14,7 +14,7 @@
           <w:color w:val="000000"/>
           <w:sz w:val="50"/>
         </w:rPr>
-        <w:t>OMS拉取旺店通拆合单数据</w:t>
+        <w:t>OMS发货管理展示旺店通拆合记录</w:t>
       </w:r>
     </w:p>
     <w:p>
@@ -637,7 +637,7 @@
           <w:color w:val="243447"/>
           <w:sz w:val="21"/>
         </w:rPr>
-        <w:t>拆单和合单继续在旺店通执行。OMS只拉取旺店通已完成的拆合记录、结果单号及商品数量，并与OMS原订单和原发货单建立可追溯关系。</w:t>
+        <w:t>OMS发货管理继续以原始发货单为唯一主记录。原始发货单以一条数据同步至旺店通；旺店通完成拆单或合单后，OMS拉取处理结果并作为该发货单下的只读历史展示，不新增、拆分、合并或替换OMS发货单。</w:t>
       </w:r>
     </w:p>
     <w:p>
@@ -660,7 +660,7 @@
           <w:color w:val="243447"/>
           <w:sz w:val="21"/>
         </w:rPr>
-        <w:t>此前方案要求在OMS内完成拆单和合单，再将结果同步至旺店通。业务方案现已调整：拆单和合单仍由旺店通处理，OMS不再提供拆合操作，只接收旺店通形成的拆合结果。</w:t>
+        <w:t>OMS现有发货流程以发货单为主记录，一张发货单同步至旺店通后，旺店通可能根据履约需要执行拆单或合单。旺店通拆合后会产生新的来源单与结果单关系，但这些单号属于旺店通执行层，不应反向改变OMS的发货单主数据。</w:t>
       </w:r>
     </w:p>
     <w:p>
@@ -674,7 +674,7 @@
           <w:color w:val="243447"/>
           <w:sz w:val="21"/>
         </w:rPr>
-        <w:t>旺店通拆单会把一个订单拆成多个结果单；合单会把多个来源单合成一个结果单。如果OMS只保留最初同步关系，后续物流、出库、售后和退货数据可能无法定位到原订单。因此，OMS需要拉取旺店通拆合记录，并保存来源单、结果单和商品数量之间的映射。</w:t>
+        <w:t>此前拉取方案将旺店通拆合结果设计成独立列表，并可能让用户误以为结果单对应新的OMS发货单。现明确：发货管理列表仍只展示原始发货单；拆合记录、旺店通结果单号和商品数量变化只在该发货单的“查看拆合单记录”中展示。</w:t>
       </w:r>
     </w:p>
     <w:p>
@@ -688,7 +688,7 @@
           <w:color w:val="243447"/>
           <w:sz w:val="21"/>
         </w:rPr>
-        <w:t>旺店通是拆合结果的权威数据源。OMS不得修改旺店通返回的拆合关系，也不得根据推测生成缺失关系。无法自动匹配的数据进入异常池，由业务或技术人员补充标识后重新匹配。</w:t>
+        <w:t>旺店通是拆合结果的权威数据源。OMS不执行拆合、不修改旺店通结果，也不根据旺店通结果生成新的OMS发货单。无法匹配的返回数据进入后台异常处理，不能污染发货管理主列表。</w:t>
       </w:r>
     </w:p>
     <w:p>
@@ -713,7 +713,7 @@
           <w:color w:val="243447"/>
           <w:sz w:val="20"/>
         </w:rPr>
-        <w:t>完整拉取：</w:t>
+        <w:t>主记录稳定：</w:t>
       </w:r>
       <w:r>
         <w:rPr>
@@ -721,7 +721,7 @@
           <w:color w:val="243447"/>
           <w:sz w:val="20"/>
         </w:rPr>
-        <w:t>通过定时任务和人工按钮拉取旺店通已完成的拆单、合单记录。</w:t>
+        <w:t>无论旺店通拆分为几张单或合并多少来源单，OMS原始发货单在列表中始终只保留一条。</w:t>
       </w:r>
     </w:p>
     <w:p>
@@ -737,7 +737,7 @@
           <w:color w:val="243447"/>
           <w:sz w:val="20"/>
         </w:rPr>
-        <w:t>稳定映射：</w:t>
+        <w:t>处理可追溯：</w:t>
       </w:r>
       <w:r>
         <w:rPr>
@@ -745,7 +745,7 @@
           <w:color w:val="243447"/>
           <w:sz w:val="20"/>
         </w:rPr>
-        <w:t>建立旺店通来源单、结果单与OMS原订单、原发货单的双向关系。</w:t>
+        <w:t>从原发货单直接查看旺店通拆单、合单的来源单、结果单、商品及数量。</w:t>
       </w:r>
     </w:p>
     <w:p>
@@ -761,7 +761,7 @@
           <w:color w:val="243447"/>
           <w:sz w:val="20"/>
         </w:rPr>
-        <w:t>数量可追溯：</w:t>
+        <w:t>同步边界清晰：</w:t>
       </w:r>
       <w:r>
         <w:rPr>
@@ -769,7 +769,7 @@
           <w:color w:val="243447"/>
           <w:sz w:val="20"/>
         </w:rPr>
-        <w:t>按商品行保留拆前、拆后或合并前、合并后的数量来源。</w:t>
+        <w:t>OMS只负责首次同步发货单和后续拉取拆合结果，不在OMS内执行拆合。</w:t>
       </w:r>
     </w:p>
     <w:p>
@@ -785,7 +785,7 @@
           <w:color w:val="243447"/>
           <w:sz w:val="20"/>
         </w:rPr>
-        <w:t>异常可恢复：</w:t>
+        <w:t>异常不污染主数据：</w:t>
       </w:r>
       <w:r>
         <w:rPr>
@@ -793,7 +793,7 @@
           <w:color w:val="243447"/>
           <w:sz w:val="20"/>
         </w:rPr>
-        <w:t>未匹配、数量不守恒或接口失败时保留原始数据和失败原因，支持重试。</w:t>
+        <w:t>未匹配、数量异常或接口失败时保留原始返回并告警，不新增孤立发货单。</w:t>
       </w:r>
     </w:p>
     <w:p>
@@ -809,7 +809,7 @@
           <w:color w:val="243447"/>
           <w:sz w:val="20"/>
         </w:rPr>
-        <w:t>消费一致：</w:t>
+        <w:t>下游查询一致：</w:t>
       </w:r>
       <w:r>
         <w:rPr>
@@ -817,7 +817,7 @@
           <w:color w:val="243447"/>
           <w:sz w:val="20"/>
         </w:rPr>
-        <w:t>物流、售后、退货和订单查询统一使用拉取后的实际拆合关系。</w:t>
+        <w:t>物流、售后和退货从原发货单沿拆合记录定位旺店通实际执行单。</w:t>
       </w:r>
     </w:p>
     <w:p>
@@ -840,7 +840,7 @@
           <w:color w:val="243447"/>
           <w:sz w:val="21"/>
         </w:rPr>
-        <w:t>同一旺店通拆合记录重复拉取不产生重复关系；已匹配记录可从任一旺店通来源单或结果单追溯到对应OMS订单和商品数量。</w:t>
+        <w:t>同一OMS发货单在发货管理列表中始终只有一条；拆合数据拉取成功后，可在该发货单详情中查看完整旺店通处理历史，并能从结果单回溯原始发货单。</w:t>
       </w:r>
     </w:p>
     <w:p>
@@ -1043,7 +1043,7 @@
                 <w:color w:val="243447"/>
                 <w:sz w:val="17"/>
               </w:rPr>
-              <w:t>拆合在旺店通完成后，OMS仍显示原发货关系，无法确认实际执行单。</w:t>
+              <w:t>旺店通拆合后出现多个执行单号，容易误认为OMS也应新增多条发货单。</w:t>
             </w:r>
           </w:p>
         </w:tc>
@@ -1076,7 +1076,7 @@
                 <w:color w:val="243447"/>
                 <w:sz w:val="17"/>
               </w:rPr>
-              <w:t>在OMS查看旺店通拆合结果和最终单号，不重复人工录入。</w:t>
+              <w:t>发货管理保持原始一条记录，按需查看拆合历史。</w:t>
             </w:r>
           </w:p>
         </w:tc>
@@ -1147,7 +1147,7 @@
                 <w:color w:val="243447"/>
                 <w:sz w:val="17"/>
               </w:rPr>
-              <w:t>结果旺店通单号与OMS原订单之间缺少稳定关系。</w:t>
+              <w:t>仅知道旺店通结果单时，难以定位最初OMS发货单。</w:t>
             </w:r>
           </w:p>
         </w:tc>
@@ -1180,7 +1180,7 @@
                 <w:color w:val="243447"/>
                 <w:sz w:val="17"/>
               </w:rPr>
-              <w:t>输入任一单号即可定位原订单、商品数量和实际结果单。</w:t>
+              <w:t>从任一结果单追溯原发货单、原商品和数量。</w:t>
             </w:r>
           </w:p>
         </w:tc>
@@ -1251,7 +1251,7 @@
                 <w:color w:val="243447"/>
                 <w:sz w:val="17"/>
               </w:rPr>
-              <w:t>接口重复拉取、顺序错乱或字段缺失时难以判断数据是否完整。</w:t>
+              <w:t>重复拉取或字段缺失可能产生重复主记录或错误关联。</w:t>
             </w:r>
           </w:p>
         </w:tc>
@@ -1284,7 +1284,7 @@
                 <w:color w:val="243447"/>
                 <w:sz w:val="17"/>
               </w:rPr>
-              <w:t>查看拉取批次、原始记录、匹配状态和明确失败原因。</w:t>
+              <w:t>幂等挂载关系；异常数据与主列表隔离。</w:t>
             </w:r>
           </w:p>
         </w:tc>
@@ -1355,7 +1355,7 @@
                 <w:color w:val="243447"/>
                 <w:sz w:val="17"/>
               </w:rPr>
-              <w:t>无法统计哪些拆合数据已同步、哪些仍待匹配。</w:t>
+              <w:t>独立拆合列表增加理解成本，主单和执行单口径不统一。</w:t>
             </w:r>
           </w:p>
         </w:tc>
@@ -1388,7 +1388,7 @@
                 <w:color w:val="243447"/>
                 <w:sz w:val="17"/>
               </w:rPr>
-              <w:t>通过统一页面查看拉取结果与异常存量。</w:t>
+              <w:t>以OMS原发货单为统一入口，旺店通数据作为从属历史。</w:t>
             </w:r>
           </w:p>
         </w:tc>
@@ -1575,7 +1575,7 @@
                 <w:color w:val="243447"/>
                 <w:sz w:val="17"/>
               </w:rPr>
-              <w:t>拆合数据拉取</w:t>
+              <w:t>发货单首次同步</w:t>
             </w:r>
           </w:p>
         </w:tc>
@@ -1608,7 +1608,7 @@
                 <w:color w:val="243447"/>
                 <w:sz w:val="17"/>
               </w:rPr>
-              <w:t>支持定时增量拉取和人工立即拉取；保存拉取批次、水位和接口结果。</w:t>
+              <w:t>继续按现有逻辑将一条OMS发货单同步为一条旺店通原始单，并保存单号映射。</w:t>
             </w:r>
           </w:p>
         </w:tc>
@@ -1641,7 +1641,7 @@
                 <w:color w:val="243447"/>
                 <w:sz w:val="17"/>
               </w:rPr>
-              <w:t>旺店通拆合单同步页面 / 后台任务</w:t>
+              <w:t>发货管理 / 同步接口</w:t>
             </w:r>
           </w:p>
         </w:tc>
@@ -1679,7 +1679,7 @@
                 <w:color w:val="243447"/>
                 <w:sz w:val="17"/>
               </w:rPr>
-              <w:t>拆单关系入库</w:t>
+              <w:t>拆合数据拉取</w:t>
             </w:r>
           </w:p>
         </w:tc>
@@ -1712,7 +1712,7 @@
                 <w:color w:val="243447"/>
                 <w:sz w:val="17"/>
               </w:rPr>
-              <w:t>保存一个旺店通来源单到多个结果子单的关系，以及每个商品行的原数量与结果数量。</w:t>
+              <w:t>定时增量拉取旺店通已完成的拆单、合单记录；支持人工更新旺店通状态。</w:t>
             </w:r>
           </w:p>
         </w:tc>
@@ -1745,7 +1745,7 @@
                 <w:color w:val="243447"/>
                 <w:sz w:val="17"/>
               </w:rPr>
-              <w:t>拆单关系Tab</w:t>
+              <w:t>后台任务 / 发货管理按钮</w:t>
             </w:r>
           </w:p>
         </w:tc>
@@ -1783,7 +1783,7 @@
                 <w:color w:val="243447"/>
                 <w:sz w:val="17"/>
               </w:rPr>
-              <w:t>合单关系入库</w:t>
+              <w:t>原发货单挂载</w:t>
             </w:r>
           </w:p>
         </w:tc>
@@ -1816,7 +1816,7 @@
                 <w:color w:val="243447"/>
                 <w:sz w:val="17"/>
               </w:rPr>
-              <w:t>保存多个旺店通来源单到一个合并结果单的关系，并按OMS原订单保留商品数量来源。</w:t>
+              <w:t>将匹配成功的拆合记录挂载到原始OMS发货单，不新增OMS发货单。</w:t>
             </w:r>
           </w:p>
         </w:tc>
@@ -1849,7 +1849,7 @@
                 <w:color w:val="243447"/>
                 <w:sz w:val="17"/>
               </w:rPr>
-              <w:t>合单关系Tab</w:t>
+              <w:t>关系服务</w:t>
             </w:r>
           </w:p>
         </w:tc>
@@ -1887,7 +1887,7 @@
                 <w:color w:val="243447"/>
                 <w:sz w:val="17"/>
               </w:rPr>
-              <w:t>OMS订单匹配</w:t>
+              <w:t>列表摘要</w:t>
             </w:r>
           </w:p>
         </w:tc>
@@ -1920,7 +1920,7 @@
                 <w:color w:val="243447"/>
                 <w:sz w:val="17"/>
               </w:rPr>
-              <w:t>优先按OMS发货单唯一标识、原同步请求号或既有旺店通映射定位原订单。</w:t>
+              <w:t>原发货单行展示是否存在拆合记录、记录数、当前旺店通结果单和最近更新时间。</w:t>
             </w:r>
           </w:p>
         </w:tc>
@@ -1953,7 +1953,7 @@
                 <w:color w:val="243447"/>
                 <w:sz w:val="17"/>
               </w:rPr>
-              <w:t>匹配服务</w:t>
+              <w:t>发货管理列表</w:t>
             </w:r>
           </w:p>
         </w:tc>
@@ -1991,7 +1991,7 @@
                 <w:color w:val="243447"/>
                 <w:sz w:val="17"/>
               </w:rPr>
-              <w:t>异常池</w:t>
+              <w:t>拆合记录详情</w:t>
             </w:r>
           </w:p>
         </w:tc>
@@ -2024,7 +2024,7 @@
                 <w:color w:val="243447"/>
                 <w:sz w:val="17"/>
               </w:rPr>
-              <w:t>承载未匹配、映射冲突和数量异常数据，显示原因并支持重新匹配。</w:t>
+              <w:t>展示拆合时间线、来源单、结果单、处理前后商品数量和合单关联的其他来源单。</w:t>
             </w:r>
           </w:p>
         </w:tc>
@@ -2057,7 +2057,7 @@
                 <w:color w:val="243447"/>
                 <w:sz w:val="17"/>
               </w:rPr>
-              <w:t>待匹配数据Tab</w:t>
+              <w:t>详情弹窗</w:t>
             </w:r>
           </w:p>
         </w:tc>
@@ -2095,7 +2095,7 @@
                 <w:color w:val="243447"/>
                 <w:sz w:val="17"/>
               </w:rPr>
-              <w:t>关系查询</w:t>
+              <w:t>查询能力</w:t>
             </w:r>
           </w:p>
         </w:tc>
@@ -2128,7 +2128,7 @@
                 <w:color w:val="243447"/>
                 <w:sz w:val="17"/>
               </w:rPr>
-              <w:t>支持按OMS订单号、发货单号、旺店通来源单或结果单查询完整关系。</w:t>
+              <w:t>发货管理支持按原始或结果旺店通单号查询并定位原发货单。</w:t>
             </w:r>
           </w:p>
         </w:tc>
@@ -2161,7 +2161,7 @@
                 <w:color w:val="243447"/>
                 <w:sz w:val="17"/>
               </w:rPr>
-              <w:t>列表与详情弹窗</w:t>
+              <w:t>筛选区</w:t>
             </w:r>
           </w:p>
         </w:tc>
@@ -2199,7 +2199,7 @@
                 <w:color w:val="243447"/>
                 <w:sz w:val="17"/>
               </w:rPr>
-              <w:t>下游消费</w:t>
+              <w:t>后台异常处理</w:t>
             </w:r>
           </w:p>
         </w:tc>
@@ -2232,7 +2232,7 @@
                 <w:color w:val="243447"/>
                 <w:sz w:val="17"/>
               </w:rPr>
-              <w:t>订单物流、售后退货等模块读取实际拆合关系。</w:t>
+              <w:t>未匹配、映射冲突和数量异常数据保留原始响应并支持技术重试。</w:t>
             </w:r>
           </w:p>
         </w:tc>
@@ -2265,7 +2265,7 @@
                 <w:color w:val="243447"/>
                 <w:sz w:val="17"/>
               </w:rPr>
-              <w:t>既有业务页面</w:t>
+              <w:t>后台任务与监控</w:t>
             </w:r>
           </w:p>
         </w:tc>
@@ -2278,6 +2278,36 @@
       </w:pPr>
       <w:r>
         <w:t>4.2 本期不包含</w:t>
+      </w:r>
+    </w:p>
+    <w:p>
+      <w:pPr>
+        <w:pStyle w:val="ListBullet"/>
+        <w:spacing w:after="80" w:line="280" w:lineRule="auto"/>
+        <w:ind w:left="720" w:hanging="360"/>
+      </w:pPr>
+      <w:r>
+        <w:rPr>
+          <w:rFonts w:ascii="Microsoft YaHei" w:hAnsi="Microsoft YaHei" w:eastAsia="Microsoft YaHei"/>
+          <w:color w:val="243447"/>
+          <w:sz w:val="20"/>
+        </w:rPr>
+        <w:t>不新增独立的旺店通拆合单管理列表或面向业务的待匹配Tab。</w:t>
+      </w:r>
+    </w:p>
+    <w:p>
+      <w:pPr>
+        <w:pStyle w:val="ListBullet"/>
+        <w:spacing w:after="80" w:line="280" w:lineRule="auto"/>
+        <w:ind w:left="720" w:hanging="360"/>
+      </w:pPr>
+      <w:r>
+        <w:rPr>
+          <w:rFonts w:ascii="Microsoft YaHei" w:hAnsi="Microsoft YaHei" w:eastAsia="Microsoft YaHei"/>
+          <w:color w:val="243447"/>
+          <w:sz w:val="20"/>
+        </w:rPr>
+        <w:t>不把旺店通拆分结果单或合并结果单转换为新的OMS发货单。</w:t>
       </w:r>
     </w:p>
     <w:p>
@@ -2307,22 +2337,7 @@
           <w:color w:val="243447"/>
           <w:sz w:val="20"/>
         </w:rPr>
-        <w:t>不由OMS向旺店通推送拆单或合单结果，也不提供旺店通驳回订单重处理。</w:t>
-      </w:r>
-    </w:p>
-    <w:p>
-      <w:pPr>
-        <w:pStyle w:val="ListBullet"/>
-        <w:spacing w:after="80" w:line="280" w:lineRule="auto"/>
-        <w:ind w:left="720" w:hanging="360"/>
-      </w:pPr>
-      <w:r>
-        <w:rPr>
-          <w:rFonts w:ascii="Microsoft YaHei" w:hAnsi="Microsoft YaHei" w:eastAsia="Microsoft YaHei"/>
-          <w:color w:val="243447"/>
-          <w:sz w:val="20"/>
-        </w:rPr>
-        <w:t>不允许在OMS修改旺店通拆合来源单、结果单或商品数量。</w:t>
+        <w:t>不允许业务用户修改旺店通来源单、结果单或商品数量。</w:t>
       </w:r>
     </w:p>
     <w:p>
@@ -2555,7 +2570,7 @@
                 <w:color w:val="243447"/>
                 <w:sz w:val="17"/>
               </w:rPr>
-              <w:t>接口拉取与游标</w:t>
+              <w:t>OMS发货单唯一主记录</w:t>
             </w:r>
           </w:p>
         </w:tc>
@@ -2588,7 +2603,7 @@
                 <w:color w:val="243447"/>
                 <w:sz w:val="17"/>
               </w:rPr>
-              <w:t>定时与人工拉取共用幂等机制；失败不推进成功水位。</w:t>
+              <w:t>旺店通拆合前后，发货管理记录数和OMS发货单号不变。</w:t>
             </w:r>
           </w:p>
         </w:tc>
@@ -2659,7 +2674,7 @@
                 <w:color w:val="243447"/>
                 <w:sz w:val="17"/>
               </w:rPr>
-              <w:t>拆单与合单关系模型</w:t>
+              <w:t>首次同步与单号映射</w:t>
             </w:r>
           </w:p>
         </w:tc>
@@ -2692,7 +2707,7 @@
                 <w:color w:val="243447"/>
                 <w:sz w:val="17"/>
               </w:rPr>
-              <w:t>支持一对多、多对一和多级拆合链；保留商品行来源数量。</w:t>
+              <w:t>一条OMS发货单只同步一次并保存旺店通原单映射。</w:t>
             </w:r>
           </w:p>
         </w:tc>
@@ -2763,7 +2778,7 @@
                 <w:color w:val="243447"/>
                 <w:sz w:val="17"/>
               </w:rPr>
-              <w:t>OMS订单匹配</w:t>
+              <w:t>拆合记录拉取与幂等</w:t>
             </w:r>
           </w:p>
         </w:tc>
@@ -2796,7 +2811,7 @@
                 <w:color w:val="243447"/>
                 <w:sz w:val="17"/>
               </w:rPr>
-              <w:t>使用稳定业务标识匹配；冲突时不得覆盖已有关系。</w:t>
+              <w:t>重复拉取只更新同一历史记录，不生成重复关系或主记录。</w:t>
             </w:r>
           </w:p>
         </w:tc>
@@ -2867,7 +2882,7 @@
                 <w:color w:val="243447"/>
                 <w:sz w:val="17"/>
               </w:rPr>
-              <w:t>数量守恒校验</w:t>
+              <w:t>列表摘要与详情入口</w:t>
             </w:r>
           </w:p>
         </w:tc>
@@ -2900,7 +2915,7 @@
                 <w:color w:val="243447"/>
                 <w:sz w:val="17"/>
               </w:rPr>
-              <w:t>拆单结果合计等于来源数量；合单结果等于全部来源数量合计。</w:t>
+              <w:t>有拆合记录时可见记录数，并能打开完整详情。</w:t>
             </w:r>
           </w:p>
         </w:tc>
@@ -2971,7 +2986,7 @@
                 <w:color w:val="243447"/>
                 <w:sz w:val="17"/>
               </w:rPr>
-              <w:t>列表与详情</w:t>
+              <w:t>来源结果与数量展示</w:t>
             </w:r>
           </w:p>
         </w:tc>
@@ -3004,7 +3019,7 @@
                 <w:color w:val="243447"/>
                 <w:sz w:val="17"/>
               </w:rPr>
-              <w:t>可查询拆合类型、来源单、结果单、OMS订单、匹配状态和拉取时间。</w:t>
+              <w:t>拆单展示处理前和各结果数量；合单展示各来源及合并结果数量。</w:t>
             </w:r>
           </w:p>
         </w:tc>
@@ -3075,7 +3090,7 @@
                 <w:color w:val="243447"/>
                 <w:sz w:val="17"/>
               </w:rPr>
-              <w:t>异常池与重试</w:t>
+              <w:t>异常隔离</w:t>
             </w:r>
           </w:p>
         </w:tc>
@@ -3108,7 +3123,7 @@
                 <w:color w:val="243447"/>
                 <w:sz w:val="17"/>
               </w:rPr>
-              <w:t>保留原始数据、错误原因和重试结果。</w:t>
+              <w:t>匹配失败或数量异常时不在发货管理新增记录。</w:t>
             </w:r>
           </w:p>
         </w:tc>
@@ -3179,7 +3194,7 @@
                 <w:color w:val="243447"/>
                 <w:sz w:val="17"/>
               </w:rPr>
-              <w:t>导出与批量重新匹配</w:t>
+              <w:t>跨单号查询</w:t>
             </w:r>
           </w:p>
         </w:tc>
@@ -3212,7 +3227,7 @@
                 <w:color w:val="243447"/>
                 <w:sz w:val="17"/>
               </w:rPr>
-              <w:t>支持导出异常数据并按补齐的映射标识批量重试。</w:t>
+              <w:t>输入旺店通原单或结果单均可定位原OMS发货单。</w:t>
             </w:r>
           </w:p>
         </w:tc>
@@ -3283,7 +3298,7 @@
                 <w:color w:val="243447"/>
                 <w:sz w:val="17"/>
               </w:rPr>
-              <w:t>关系链可视化</w:t>
+              <w:t>多级关系链</w:t>
             </w:r>
           </w:p>
         </w:tc>
@@ -3316,7 +3331,7 @@
                 <w:color w:val="243447"/>
                 <w:sz w:val="17"/>
               </w:rPr>
-              <w:t>展示跨多次拆合的完整树状或链式关系。</w:t>
+              <w:t>展示结果单再次拆合后的完整处理时间线。</w:t>
             </w:r>
           </w:p>
         </w:tc>
@@ -3342,7 +3357,7 @@
         <w:keepNext/>
       </w:pPr>
       <w:r>
-        <w:t>6.1 数据拉取流程</w:t>
+        <w:t>6.1 业务流程</w:t>
       </w:r>
     </w:p>
     <w:p>
@@ -3350,7 +3365,7 @@
         <w:drawing>
           <wp:inline xmlns:a="http://schemas.openxmlformats.org/drawingml/2006/main" xmlns:pic="http://schemas.openxmlformats.org/drawingml/2006/picture">
             <wp:extent cx="6080760" cy="2567432"/>
-            <wp:docPr id="1" name="Picture 1" title="旺店通拆合单数据拉取流程" descr="旺店通完成拆合后，OMS增量拉取、幂等入库、匹配原订单并进入成功关系记录或待匹配池。"/>
+            <wp:docPr id="1" name="Picture 1" title="发货单同步与旺店通拆合记录回传流程" descr="OMS保留一条发货单并同步旺店通，旺店通拆合后由OMS拉取历史并挂载到原发货单。"/>
             <wp:cNvGraphicFramePr>
               <a:graphicFrameLocks noChangeAspect="1"/>
             </wp:cNvGraphicFramePr>
@@ -3393,7 +3408,7 @@
           <w:color w:val="667085"/>
           <w:sz w:val="18"/>
         </w:rPr>
-        <w:t>图1 旺店通拆合单数据拉取流程</w:t>
+        <w:t>图1 发货单同步与旺店通拆合记录回传流程</w:t>
       </w:r>
     </w:p>
     <w:p>
@@ -3402,7 +3417,7 @@
         <w:keepNext/>
       </w:pPr>
       <w:r>
-        <w:t>6.2 拆单与合单关系</w:t>
+        <w:t>6.2 页面展示关系</w:t>
       </w:r>
     </w:p>
     <w:p>
@@ -3410,7 +3425,7 @@
         <w:drawing>
           <wp:inline xmlns:a="http://schemas.openxmlformats.org/drawingml/2006/main" xmlns:pic="http://schemas.openxmlformats.org/drawingml/2006/picture">
             <wp:extent cx="6080760" cy="2567432"/>
-            <wp:docPr id="2" name="Picture 2" title="拆单与合单关系映射" descr="拆单是一张来源单对应多张结果子单，合单是多张来源单对应一张合并结果单，并保留商品数量来源。"/>
+            <wp:docPr id="2" name="Picture 2" title="发货管理主记录与拆合历史展示模型" descr="发货管理列表只有一条OMS发货单，拆单和合单仅在该发货单的记录弹窗中展示。"/>
             <wp:cNvGraphicFramePr>
               <a:graphicFrameLocks noChangeAspect="1"/>
             </wp:cNvGraphicFramePr>
@@ -3453,7 +3468,7 @@
           <w:color w:val="667085"/>
           <w:sz w:val="18"/>
         </w:rPr>
-        <w:t>图2 拆单与合单关系映射</w:t>
+        <w:t>图2 发货管理主记录与拆合历史展示模型</w:t>
       </w:r>
     </w:p>
     <w:p>
@@ -3587,7 +3602,7 @@
                 <w:color w:val="243447"/>
                 <w:sz w:val="18"/>
               </w:rPr>
-              <w:t>页面头部</w:t>
+              <w:t>发货管理列表</w:t>
             </w:r>
           </w:p>
         </w:tc>
@@ -3620,7 +3635,7 @@
                 <w:color w:val="243447"/>
                 <w:sz w:val="18"/>
               </w:rPr>
-              <w:t>突出“立即拉取”主操作，并明确OMS只拉取、不执行拆合。</w:t>
+              <w:t>沿用现有发货单卡片结构，不增加拆合结果行；一张原发货单只展示一次。</w:t>
             </w:r>
           </w:p>
         </w:tc>
@@ -3658,7 +3673,7 @@
                 <w:color w:val="243447"/>
                 <w:sz w:val="18"/>
               </w:rPr>
-              <w:t>数据摘要</w:t>
+              <w:t>筛选区</w:t>
             </w:r>
           </w:p>
         </w:tc>
@@ -3691,7 +3706,7 @@
                 <w:color w:val="243447"/>
                 <w:sz w:val="18"/>
               </w:rPr>
-              <w:t>展示最近成功拉取时间、本次记录数、已匹配数和待匹配数；原型数字明确为演示数据。</w:t>
+              <w:t>保留发货单、订单、客户、同步状态等条件，并支持按旺店通原单或结果单号定位。</w:t>
             </w:r>
           </w:p>
         </w:tc>
@@ -3729,7 +3744,7 @@
                 <w:color w:val="243447"/>
                 <w:sz w:val="18"/>
               </w:rPr>
-              <w:t>筛选区</w:t>
+              <w:t>拆合摘要</w:t>
             </w:r>
           </w:p>
         </w:tc>
@@ -3762,7 +3777,7 @@
                 <w:color w:val="243447"/>
                 <w:sz w:val="18"/>
               </w:rPr>
-              <w:t>按OMS订单、OMS发货单、旺店通单号、拆合类型、匹配状态和操作时间查询。</w:t>
+              <w:t>在原发货单行展示拆合类型、记录数、当前结果单数量和最近更新时间。</w:t>
             </w:r>
           </w:p>
         </w:tc>
@@ -3800,7 +3815,7 @@
                 <w:color w:val="243447"/>
                 <w:sz w:val="18"/>
               </w:rPr>
-              <w:t>记录Tab</w:t>
+              <w:t>查看拆合单记录</w:t>
             </w:r>
           </w:p>
         </w:tc>
@@ -3833,7 +3848,7 @@
                 <w:color w:val="243447"/>
                 <w:sz w:val="18"/>
               </w:rPr>
-              <w:t>全部记录、拆单关系、合单关系、待匹配数据。</w:t>
+              <w:t>弹窗顶部先展示原始OMS发货单，再按时间顺序展示旺店通拆单与合单历史。</w:t>
             </w:r>
           </w:p>
         </w:tc>
@@ -3871,7 +3886,7 @@
                 <w:color w:val="243447"/>
                 <w:sz w:val="18"/>
               </w:rPr>
-              <w:t>关系详情</w:t>
+              <w:t>拆单记录</w:t>
             </w:r>
           </w:p>
         </w:tc>
@@ -3904,7 +3919,7 @@
                 <w:color w:val="243447"/>
                 <w:sz w:val="18"/>
               </w:rPr>
-              <w:t>展示旺店通来源单、拆合记录、结果单、商品数量、OMS匹配结果和校验结论。</w:t>
+              <w:t>先展示处理前旺店通单和原商品数量，再展示各结果单及分配数量。</w:t>
             </w:r>
           </w:p>
         </w:tc>
@@ -3942,7 +3957,7 @@
                 <w:color w:val="243447"/>
                 <w:sz w:val="18"/>
               </w:rPr>
-              <w:t>待匹配处理</w:t>
+              <w:t>合单记录</w:t>
             </w:r>
           </w:p>
         </w:tc>
@@ -3975,7 +3990,7 @@
                 <w:color w:val="243447"/>
                 <w:sz w:val="18"/>
               </w:rPr>
-              <w:t>展示失败原因和建议处理方式；重新匹配不修改旺店通原始拆合数据。</w:t>
+              <w:t>先展示各来源旺店通单和来源商品数量，再展示合并结果单；说明相关OMS发货单仍各自保留。</w:t>
             </w:r>
           </w:p>
         </w:tc>
@@ -4015,7 +4030,7 @@
         <w:keepNext/>
       </w:pPr>
       <w:r>
-        <w:t>7.1 数据源与拉取规则</w:t>
+        <w:t>7.1 OMS发货单主记录规则</w:t>
       </w:r>
     </w:p>
     <w:tbl>
@@ -4140,7 +4155,7 @@
                 <w:color w:val="243447"/>
                 <w:sz w:val="17"/>
               </w:rPr>
-              <w:t>权威数据源</w:t>
+              <w:t>唯一主记录</w:t>
             </w:r>
           </w:p>
         </w:tc>
@@ -4173,7 +4188,7 @@
                 <w:color w:val="243447"/>
                 <w:sz w:val="17"/>
               </w:rPr>
-              <w:t>旺店通拆合记录是拆合结果的唯一权威来源，OMS不得自行推导或改写。</w:t>
+              <w:t>OMS发货单是发货管理唯一主记录。旺店通拆单、合单及多级拆合均不改变其编号和列表记录数。</w:t>
             </w:r>
           </w:p>
         </w:tc>
@@ -4211,7 +4226,7 @@
                 <w:color w:val="243447"/>
                 <w:sz w:val="17"/>
               </w:rPr>
-              <w:t>拉取对象</w:t>
+              <w:t>原始业务数据</w:t>
             </w:r>
           </w:p>
         </w:tc>
@@ -4244,7 +4259,7 @@
                 <w:color w:val="243447"/>
                 <w:sz w:val="17"/>
               </w:rPr>
-              <w:t>仅拉取旺店通已完成且可稳定读取来源单、结果单和商品数量的拆单、合单记录。</w:t>
+              <w:t>OMS保留原订单、原商品行和原发货数量，不使用旺店通结果覆盖主记录。</w:t>
             </w:r>
           </w:p>
         </w:tc>
@@ -4282,7 +4297,7 @@
                 <w:color w:val="243447"/>
                 <w:sz w:val="17"/>
               </w:rPr>
-              <w:t>触发方式</w:t>
+              <w:t>拆合从属数据</w:t>
             </w:r>
           </w:p>
         </w:tc>
@@ -4315,7 +4330,7 @@
                 <w:color w:val="243447"/>
                 <w:sz w:val="17"/>
               </w:rPr>
-              <w:t>后台定时任务自动拉取；页面提供人工立即拉取。两者使用相同游标和幂等规则。</w:t>
+              <w:t>旺店通拆合记录以子表或关系表挂载到原发货单，通过详情入口读取。</w:t>
             </w:r>
           </w:p>
         </w:tc>
@@ -4353,7 +4368,7 @@
                 <w:color w:val="243447"/>
                 <w:sz w:val="17"/>
               </w:rPr>
-              <w:t>增量游标</w:t>
+              <w:t>合单多主关联</w:t>
             </w:r>
           </w:p>
         </w:tc>
@@ -4386,7 +4401,7 @@
                 <w:color w:val="243447"/>
                 <w:sz w:val="17"/>
               </w:rPr>
-              <w:t>至少使用旺店通更新时间与记录唯一ID组合推进水位，避免同一时间多条记录遗漏。具体分页和回溯窗口由接口联调确认。</w:t>
+              <w:t>一条旺店通合单记录可关联多张OMS原发货单；各原发货单仍各自展示，并可查看同一合单历史。</w:t>
             </w:r>
           </w:p>
         </w:tc>
@@ -4424,7 +4439,7 @@
                 <w:color w:val="243447"/>
                 <w:sz w:val="17"/>
               </w:rPr>
-              <w:t>水位推进</w:t>
+              <w:t>列表展示</w:t>
             </w:r>
           </w:p>
         </w:tc>
@@ -4457,7 +4472,7 @@
                 <w:color w:val="243447"/>
                 <w:sz w:val="17"/>
               </w:rPr>
-              <w:t>当前批次全部分页读取并成功持久化后才推进成功水位；部分失败时保留原水位或按可恢复断点重试。</w:t>
+              <w:t>默认不展开拆合明细，只展示有无记录、记录数、当前结果单和查看入口。</w:t>
             </w:r>
           </w:p>
         </w:tc>
@@ -4495,7 +4510,7 @@
                 <w:color w:val="243447"/>
                 <w:sz w:val="17"/>
               </w:rPr>
-              <w:t>原始数据</w:t>
+              <w:t>删除约束</w:t>
             </w:r>
           </w:p>
         </w:tc>
@@ -4528,78 +4543,7 @@
                 <w:color w:val="243447"/>
                 <w:sz w:val="17"/>
               </w:rPr>
-              <w:t>保存关键原始响应、旺店通记录ID、更新时间、拉取批次和接口请求号，供问题追踪。</w:t>
-            </w:r>
-          </w:p>
-        </w:tc>
-      </w:tr>
-      <w:tr>
-        <w:trPr>
-          <w:cantSplit/>
-        </w:trPr>
-        <w:tc>
-          <w:tcPr>
-            <w:tcW w:type="dxa" w:w="2200"/>
-            <w:tcMar>
-              <w:top w:w="80" w:type="dxa"/>
-              <w:start w:w="120" w:type="dxa"/>
-              <w:bottom w:w="80" w:type="dxa"/>
-              <w:end w:w="120" w:type="dxa"/>
-            </w:tcMar>
-            <w:vAlign w:val="center"/>
-          </w:tcPr>
-          <w:p>
-            <w:pPr>
-              <w:spacing w:before="0" w:after="20" w:line="259" w:lineRule="auto"/>
-            </w:pPr>
-            <w:r>
-              <w:rPr>
-                <w:rFonts w:ascii="Microsoft YaHei" w:hAnsi="Microsoft YaHei" w:eastAsia="Microsoft YaHei"/>
-                <w:color w:val="243447"/>
-                <w:sz w:val="17"/>
-              </w:rPr>
-            </w:r>
-            <w:r>
-              <w:rPr>
-                <w:rFonts w:ascii="Microsoft YaHei" w:hAnsi="Microsoft YaHei" w:eastAsia="Microsoft YaHei"/>
-                <w:b w:val="0"/>
-                <w:color w:val="243447"/>
-                <w:sz w:val="17"/>
-              </w:rPr>
-              <w:t>只读边界</w:t>
-            </w:r>
-          </w:p>
-        </w:tc>
-        <w:tc>
-          <w:tcPr>
-            <w:tcW w:type="dxa" w:w="7160"/>
-            <w:tcMar>
-              <w:top w:w="80" w:type="dxa"/>
-              <w:start w:w="120" w:type="dxa"/>
-              <w:bottom w:w="80" w:type="dxa"/>
-              <w:end w:w="120" w:type="dxa"/>
-            </w:tcMar>
-            <w:vAlign w:val="center"/>
-          </w:tcPr>
-          <w:p>
-            <w:pPr>
-              <w:spacing w:before="0" w:after="20" w:line="259" w:lineRule="auto"/>
-            </w:pPr>
-            <w:r>
-              <w:rPr>
-                <w:rFonts w:ascii="Microsoft YaHei" w:hAnsi="Microsoft YaHei" w:eastAsia="Microsoft YaHei"/>
-                <w:color w:val="243447"/>
-                <w:sz w:val="17"/>
-              </w:rPr>
-            </w:r>
-            <w:r>
-              <w:rPr>
-                <w:rFonts w:ascii="Microsoft YaHei" w:hAnsi="Microsoft YaHei" w:eastAsia="Microsoft YaHei"/>
-                <w:b w:val="0"/>
-                <w:color w:val="243447"/>
-                <w:sz w:val="17"/>
-              </w:rPr>
-              <w:t>OMS拉取任务不向旺店通写入拆合数据，不触发重新拆合。</w:t>
+              <w:t>原发货单被业务引用后不得因旺店通关系更新而删除；拆合历史保留版本。</w:t>
             </w:r>
           </w:p>
         </w:tc>
@@ -4611,7 +4555,7 @@
         <w:keepNext/>
       </w:pPr>
       <w:r>
-        <w:t>7.2 关系与数量规则</w:t>
+        <w:t>7.2 数据拉取与匹配规则</w:t>
       </w:r>
     </w:p>
     <w:tbl>
@@ -4736,7 +4680,7 @@
                 <w:color w:val="243447"/>
                 <w:sz w:val="17"/>
               </w:rPr>
-              <w:t>拆单关系</w:t>
+              <w:t>权威数据源</w:t>
             </w:r>
           </w:p>
         </w:tc>
@@ -4769,7 +4713,7 @@
                 <w:color w:val="243447"/>
                 <w:sz w:val="17"/>
               </w:rPr>
-              <w:t>一个旺店通来源单对应一个拆单记录和多张结果子单；每个结果商品行保存来源商品行与数量。</w:t>
+              <w:t>旺店通拆合记录是执行结果的唯一权威来源，OMS不得自行推导或改写。</w:t>
             </w:r>
           </w:p>
         </w:tc>
@@ -4807,7 +4751,7 @@
                 <w:color w:val="243447"/>
                 <w:sz w:val="17"/>
               </w:rPr>
-              <w:t>合单关系</w:t>
+              <w:t>触发方式</w:t>
             </w:r>
           </w:p>
         </w:tc>
@@ -4840,7 +4784,7 @@
                 <w:color w:val="243447"/>
                 <w:sz w:val="17"/>
               </w:rPr>
-              <w:t>多张旺店通来源单对应一个合单记录和一张结果单；相同SKU可汇总展示，但后台按OMS原订单商品行分别保存来源数量。</w:t>
+              <w:t>后台定时增量拉取；发货管理可提供人工更新旺店通状态。两者共用游标和幂等规则。</w:t>
             </w:r>
           </w:p>
         </w:tc>
@@ -4878,7 +4822,7 @@
                 <w:color w:val="243447"/>
                 <w:sz w:val="17"/>
               </w:rPr>
-              <w:t>数量守恒</w:t>
+              <w:t>增量游标</w:t>
             </w:r>
           </w:p>
         </w:tc>
@@ -4911,7 +4855,7 @@
                 <w:color w:val="243447"/>
                 <w:sz w:val="17"/>
               </w:rPr>
-              <w:t>拆单结果商品数量合计必须等于来源商品数量；合单结果数量必须等于全部来源单对应商品数量合计。</w:t>
+              <w:t>使用旺店通更新时间与记录唯一ID组合推进水位，避免同一时间多条记录遗漏。</w:t>
             </w:r>
           </w:p>
         </w:tc>
@@ -4949,7 +4893,7 @@
                 <w:color w:val="243447"/>
                 <w:sz w:val="17"/>
               </w:rPr>
-              <w:t>多级拆合</w:t>
+              <w:t>主记录匹配</w:t>
             </w:r>
           </w:p>
         </w:tc>
@@ -4982,7 +4926,7 @@
                 <w:color w:val="243447"/>
                 <w:sz w:val="17"/>
               </w:rPr>
-              <w:t>旺店通结果单再次参与拆单或合单时，新增下一层关系，不覆盖上一层。</w:t>
+              <w:t>优先使用OMS发货单唯一ID、原同步请求号或既有旺店通原单映射定位原发货单。</w:t>
             </w:r>
           </w:p>
         </w:tc>
@@ -5020,7 +4964,7 @@
                 <w:color w:val="243447"/>
                 <w:sz w:val="17"/>
               </w:rPr>
-              <w:t>当前结果单</w:t>
+              <w:t>幂等写入</w:t>
             </w:r>
           </w:p>
         </w:tc>
@@ -5053,7 +4997,7 @@
                 <w:color w:val="243447"/>
                 <w:sz w:val="17"/>
               </w:rPr>
-              <w:t>沿关系链定位没有后续拆合的叶子结果单，作为物流和售后查询的实际旺店通单。</w:t>
+              <w:t>同一旺店通拆合记录重复返回时更新原历史，不重复挂载。</w:t>
             </w:r>
           </w:p>
         </w:tc>
@@ -5091,7 +5035,7 @@
                 <w:color w:val="243447"/>
                 <w:sz w:val="17"/>
               </w:rPr>
-              <w:t>历史保留</w:t>
+              <w:t>匹配失败</w:t>
             </w:r>
           </w:p>
         </w:tc>
@@ -5124,7 +5068,78 @@
                 <w:color w:val="243447"/>
                 <w:sz w:val="17"/>
               </w:rPr>
-              <w:t>关系被后续更新或冲正时保留历史版本、更新时间和原始响应，不物理删除已被业务引用的关系。</w:t>
+              <w:t>保存原始数据并进入后台异常处理；不在发货管理创建临时或孤立发货单。</w:t>
+            </w:r>
+          </w:p>
+        </w:tc>
+      </w:tr>
+      <w:tr>
+        <w:trPr>
+          <w:cantSplit/>
+        </w:trPr>
+        <w:tc>
+          <w:tcPr>
+            <w:tcW w:type="dxa" w:w="2200"/>
+            <w:tcMar>
+              <w:top w:w="80" w:type="dxa"/>
+              <w:start w:w="120" w:type="dxa"/>
+              <w:bottom w:w="80" w:type="dxa"/>
+              <w:end w:w="120" w:type="dxa"/>
+            </w:tcMar>
+            <w:vAlign w:val="center"/>
+          </w:tcPr>
+          <w:p>
+            <w:pPr>
+              <w:spacing w:before="0" w:after="20" w:line="259" w:lineRule="auto"/>
+            </w:pPr>
+            <w:r>
+              <w:rPr>
+                <w:rFonts w:ascii="Microsoft YaHei" w:hAnsi="Microsoft YaHei" w:eastAsia="Microsoft YaHei"/>
+                <w:color w:val="243447"/>
+                <w:sz w:val="17"/>
+              </w:rPr>
+            </w:r>
+            <w:r>
+              <w:rPr>
+                <w:rFonts w:ascii="Microsoft YaHei" w:hAnsi="Microsoft YaHei" w:eastAsia="Microsoft YaHei"/>
+                <w:b w:val="0"/>
+                <w:color w:val="243447"/>
+                <w:sz w:val="17"/>
+              </w:rPr>
+              <w:t>只读边界</w:t>
+            </w:r>
+          </w:p>
+        </w:tc>
+        <w:tc>
+          <w:tcPr>
+            <w:tcW w:type="dxa" w:w="7160"/>
+            <w:tcMar>
+              <w:top w:w="80" w:type="dxa"/>
+              <w:start w:w="120" w:type="dxa"/>
+              <w:bottom w:w="80" w:type="dxa"/>
+              <w:end w:w="120" w:type="dxa"/>
+            </w:tcMar>
+            <w:vAlign w:val="center"/>
+          </w:tcPr>
+          <w:p>
+            <w:pPr>
+              <w:spacing w:before="0" w:after="20" w:line="259" w:lineRule="auto"/>
+            </w:pPr>
+            <w:r>
+              <w:rPr>
+                <w:rFonts w:ascii="Microsoft YaHei" w:hAnsi="Microsoft YaHei" w:eastAsia="Microsoft YaHei"/>
+                <w:color w:val="243447"/>
+                <w:sz w:val="17"/>
+              </w:rPr>
+            </w:r>
+            <w:r>
+              <w:rPr>
+                <w:rFonts w:ascii="Microsoft YaHei" w:hAnsi="Microsoft YaHei" w:eastAsia="Microsoft YaHei"/>
+                <w:b w:val="0"/>
+                <w:color w:val="243447"/>
+                <w:sz w:val="17"/>
+              </w:rPr>
+              <w:t>OMS拉取任务不向旺店通写入拆合数据，也不触发重新拆合。</w:t>
             </w:r>
           </w:p>
         </w:tc>
@@ -5136,7 +5151,7 @@
         <w:keepNext/>
       </w:pPr>
       <w:r>
-        <w:t>7.3 OMS匹配规则</w:t>
+        <w:t>7.3 关系与数量规则</w:t>
       </w:r>
     </w:p>
     <w:p>
@@ -5151,7 +5166,7 @@
           <w:color w:val="243447"/>
           <w:sz w:val="20"/>
         </w:rPr>
-        <w:t>优先读取旺店通记录中的OMS发货单唯一ID、OMS同步请求号或双方约定的业务标识。</w:t>
+        <w:t>拆单记录保存一张来源单、拆单记录ID、多张结果单，以及每个商品行的处理前数量和各结果数量。</w:t>
       </w:r>
     </w:p>
     <w:p>
@@ -5166,7 +5181,7 @@
           <w:color w:val="243447"/>
           <w:sz w:val="20"/>
         </w:rPr>
-        <w:t>若拆合来源单已存在旺店通单号与OMS发货单映射，可沿既有映射定位原订单商品行。</w:t>
+        <w:t>合单记录保存多张来源单、合单记录ID、一张结果单，并按OMS原发货单商品行保留来源数量。</w:t>
       </w:r>
     </w:p>
     <w:p>
@@ -5181,7 +5196,7 @@
           <w:color w:val="243447"/>
           <w:sz w:val="20"/>
         </w:rPr>
-        <w:t>多个OMS发货单同时命中或稳定标识缺失时进入待匹配池，不按客户、地址、商品名称等字段自动选定。</w:t>
+        <w:t>拆单结果数量合计必须等于来源数量；合单结果数量必须等于全部来源数量合计。</w:t>
       </w:r>
     </w:p>
     <w:p>
@@ -5196,7 +5211,7 @@
           <w:color w:val="243447"/>
           <w:sz w:val="20"/>
         </w:rPr>
-        <w:t>重新匹配只更新OMS关系和匹配结果，不修改旺店通来源单、结果单和商品数量。</w:t>
+        <w:t>结果单再次参与拆单或合单时新增下一条历史，按旺店通操作时间排序，不覆盖上一条记录。</w:t>
       </w:r>
     </w:p>
     <w:p>
@@ -5211,7 +5226,7 @@
           <w:color w:val="243447"/>
           <w:sz w:val="20"/>
         </w:rPr>
-        <w:t>关系写入前检查同一旺店通拆合记录是否已存在；重复拉取执行幂等更新。</w:t>
+        <w:t>当前结果单是关系链中没有后续拆合的旺店通结果单；它只用于执行追溯，不替代OMS发货单号。</w:t>
       </w:r>
     </w:p>
     <w:p>
@@ -5345,7 +5360,7 @@
                 <w:color w:val="243447"/>
                 <w:sz w:val="17"/>
               </w:rPr>
-              <w:t>拉取批次</w:t>
+              <w:t>OMS发货单</w:t>
             </w:r>
           </w:p>
         </w:tc>
@@ -5378,7 +5393,7 @@
                 <w:color w:val="243447"/>
                 <w:sz w:val="17"/>
               </w:rPr>
-              <w:t>执行中、成功、部分失败、失败；页面主列表不必展示执行中明细，但应提供任务反馈。</w:t>
+              <w:t>沿用现有发货、同步、接单等状态，不新增拆单后发货单状态。</w:t>
             </w:r>
           </w:p>
         </w:tc>
@@ -5416,7 +5431,7 @@
                 <w:color w:val="243447"/>
                 <w:sz w:val="17"/>
               </w:rPr>
-              <w:t>拆合记录</w:t>
+              <w:t>拆合摘要</w:t>
             </w:r>
           </w:p>
         </w:tc>
@@ -5449,7 +5464,7 @@
                 <w:color w:val="243447"/>
                 <w:sz w:val="17"/>
               </w:rPr>
-              <w:t>已匹配、待匹配、数据异常。状态文字与颜色同时展示。</w:t>
+              <w:t>无拆合记录、有拆合记录、数据异常；状态同时使用文字和颜色。</w:t>
             </w:r>
           </w:p>
         </w:tc>
@@ -5487,7 +5502,7 @@
                 <w:color w:val="243447"/>
                 <w:sz w:val="17"/>
               </w:rPr>
-              <w:t>页面权限</w:t>
+              <w:t>人工更新</w:t>
             </w:r>
           </w:p>
         </w:tc>
@@ -5520,7 +5535,7 @@
                 <w:color w:val="243447"/>
                 <w:sz w:val="17"/>
               </w:rPr>
-              <w:t>具备发货管理查询权限的人员可查看；人工拉取和重新匹配需要单独操作权限。</w:t>
+              <w:t>需要旺店通状态更新权限；执行中禁用按钮，成功或失败给出明确反馈。</w:t>
             </w:r>
           </w:p>
         </w:tc>
@@ -5558,7 +5573,7 @@
                 <w:color w:val="243447"/>
                 <w:sz w:val="17"/>
               </w:rPr>
-              <w:t>数据修改</w:t>
+              <w:t>拆合详情</w:t>
             </w:r>
           </w:p>
         </w:tc>
@@ -5591,7 +5606,7 @@
                 <w:color w:val="243447"/>
                 <w:sz w:val="17"/>
               </w:rPr>
-              <w:t>业务用户不能编辑旺店通拆合关系与商品数量。</w:t>
+              <w:t>具备发货管理查询权限的人员可查看，但不能编辑旺店通记录和数量。</w:t>
             </w:r>
           </w:p>
         </w:tc>
@@ -5802,7 +5817,7 @@
                 <w:color w:val="243447"/>
                 <w:sz w:val="16"/>
               </w:rPr>
-              <w:t>当前批次失败或进入重试，不推进成功水位。</w:t>
+              <w:t>本次更新失败或进入重试，不推进成功水位。</w:t>
             </w:r>
           </w:p>
         </w:tc>
@@ -5835,7 +5850,7 @@
                 <w:color w:val="243447"/>
                 <w:sz w:val="16"/>
               </w:rPr>
-              <w:t>显示失败原因和重试入口，保留上次成功时间。</w:t>
+              <w:t>保留原发货单及上次成功记录，提示失败原因。</w:t>
             </w:r>
           </w:p>
         </w:tc>
@@ -5873,7 +5888,7 @@
                 <w:color w:val="243447"/>
                 <w:sz w:val="16"/>
               </w:rPr>
-              <w:t>分页拉取中途失败</w:t>
+              <w:t>重复返回同一拆合记录</w:t>
             </w:r>
           </w:p>
         </w:tc>
@@ -5906,7 +5921,7 @@
                 <w:color w:val="243447"/>
                 <w:sz w:val="16"/>
               </w:rPr>
-              <w:t>记录已完成页和失败页；按接口能力从安全断点重试。</w:t>
+              <w:t>按旺店通记录ID幂等更新。</w:t>
             </w:r>
           </w:p>
         </w:tc>
@@ -5939,7 +5954,7 @@
                 <w:color w:val="243447"/>
                 <w:sz w:val="16"/>
               </w:rPr>
-              <w:t>批次标记部分失败，不把未读取数据计为成功。</w:t>
+              <w:t>拆合记录数不重复增加。</w:t>
             </w:r>
           </w:p>
         </w:tc>
@@ -5977,7 +5992,7 @@
                 <w:color w:val="243447"/>
                 <w:sz w:val="16"/>
               </w:rPr>
-              <w:t>重复返回同一拆合记录</w:t>
+              <w:t>旺店通记录无法匹配原发货单</w:t>
             </w:r>
           </w:p>
         </w:tc>
@@ -6010,7 +6025,7 @@
                 <w:color w:val="243447"/>
                 <w:sz w:val="16"/>
               </w:rPr>
-              <w:t>按旺店通记录ID幂等更新。</w:t>
+              <w:t>保存原始返回并进入后台异常处理。</w:t>
             </w:r>
           </w:p>
         </w:tc>
@@ -6043,7 +6058,7 @@
                 <w:color w:val="243447"/>
                 <w:sz w:val="16"/>
               </w:rPr>
-              <w:t>不新增重复关系。</w:t>
+              <w:t>发货管理不新增孤立记录；必要时显示数据待更新。</w:t>
             </w:r>
           </w:p>
         </w:tc>
@@ -6081,7 +6096,7 @@
                 <w:color w:val="243447"/>
                 <w:sz w:val="16"/>
               </w:rPr>
-              <w:t>相同更新时间包含多条记录</w:t>
+              <w:t>多个OMS发货单同时命中</w:t>
             </w:r>
           </w:p>
         </w:tc>
@@ -6114,7 +6129,7 @@
                 <w:color w:val="243447"/>
                 <w:sz w:val="16"/>
               </w:rPr>
-              <w:t>使用更新时间与唯一ID组合游标。</w:t>
+              <w:t>停止自动绑定并记录候选冲突。</w:t>
             </w:r>
           </w:p>
         </w:tc>
@@ -6147,7 +6162,7 @@
                 <w:color w:val="243447"/>
                 <w:sz w:val="16"/>
               </w:rPr>
-              <w:t>不漏拉、不重复新增。</w:t>
+              <w:t>不覆盖现有关系，由技术核对稳定标识。</w:t>
             </w:r>
           </w:p>
         </w:tc>
@@ -6185,7 +6200,7 @@
                 <w:color w:val="243447"/>
                 <w:sz w:val="16"/>
               </w:rPr>
-              <w:t>数据到达顺序错乱</w:t>
+              <w:t>拆单数量不守恒</w:t>
             </w:r>
           </w:p>
         </w:tc>
@@ -6218,7 +6233,7 @@
                 <w:color w:val="243447"/>
                 <w:sz w:val="16"/>
               </w:rPr>
-              <w:t>来源单映射尚未到达时先保留原始记录并进入待匹配。</w:t>
+              <w:t>记录标记数据异常，不作为有效执行关系供下游使用。</w:t>
             </w:r>
           </w:p>
         </w:tc>
@@ -6251,7 +6266,7 @@
                 <w:color w:val="243447"/>
                 <w:sz w:val="16"/>
               </w:rPr>
-              <w:t>提示等待前置映射或人工重试。</w:t>
+              <w:t>详情显示处理前数量、结果合计和差额。</w:t>
             </w:r>
           </w:p>
         </w:tc>
@@ -6289,7 +6304,7 @@
                 <w:color w:val="243447"/>
                 <w:sz w:val="16"/>
               </w:rPr>
-              <w:t>旺店通来源单无法匹配OMS</w:t>
+              <w:t>合单缺少部分来源单</w:t>
             </w:r>
           </w:p>
         </w:tc>
@@ -6322,7 +6337,7 @@
                 <w:color w:val="243447"/>
                 <w:sz w:val="16"/>
               </w:rPr>
-              <w:t>保存完整拆合原始数据，不写入错误订单关系。</w:t>
+              <w:t>保留已返回信息但不标记关系完整。</w:t>
             </w:r>
           </w:p>
         </w:tc>
@@ -6355,7 +6370,7 @@
                 <w:color w:val="243447"/>
                 <w:sz w:val="16"/>
               </w:rPr>
-              <w:t>进入待匹配数据并显示缺失标识。</w:t>
+              <w:t>详情提示来源数据不完整。</w:t>
             </w:r>
           </w:p>
         </w:tc>
@@ -6393,7 +6408,7 @@
                 <w:color w:val="243447"/>
                 <w:sz w:val="16"/>
               </w:rPr>
-              <w:t>多个OMS发货单同时命中</w:t>
+              <w:t>返回顺序错乱</w:t>
             </w:r>
           </w:p>
         </w:tc>
@@ -6426,7 +6441,7 @@
                 <w:color w:val="243447"/>
                 <w:sz w:val="16"/>
               </w:rPr>
-              <w:t>停止自动匹配并记录候选冲突。</w:t>
+              <w:t>先保存原始记录，待原单映射到达后自动重试匹配。</w:t>
             </w:r>
           </w:p>
         </w:tc>
@@ -6459,7 +6474,7 @@
                 <w:color w:val="243447"/>
                 <w:sz w:val="16"/>
               </w:rPr>
-              <w:t>提示存在映射冲突，需要人工确认稳定标识。</w:t>
+              <w:t>不生成新的发货单，最近更新时间保持可见。</w:t>
             </w:r>
           </w:p>
         </w:tc>
@@ -6497,7 +6512,7 @@
                 <w:color w:val="243447"/>
                 <w:sz w:val="16"/>
               </w:rPr>
-              <w:t>拆单数量不守恒</w:t>
+              <w:t>拆合关系被旺店通更新</w:t>
             </w:r>
           </w:p>
         </w:tc>
@@ -6530,7 +6545,7 @@
                 <w:color w:val="243447"/>
                 <w:sz w:val="16"/>
               </w:rPr>
-              <w:t>关系标记数据异常，不供物流或售后作为有效结果。</w:t>
+              <w:t>按更新时间更新当前版本并保留历史快照。</w:t>
             </w:r>
           </w:p>
         </w:tc>
@@ -6563,7 +6578,7 @@
                 <w:color w:val="243447"/>
                 <w:sz w:val="16"/>
               </w:rPr>
-              <w:t>展示来源数量、结果合计和差额。</w:t>
+              <w:t>详情展示最新结果和更新时间。</w:t>
             </w:r>
           </w:p>
         </w:tc>
@@ -6601,7 +6616,7 @@
                 <w:color w:val="243447"/>
                 <w:sz w:val="16"/>
               </w:rPr>
-              <w:t>合单结果缺少来源明细</w:t>
+              <w:t>人工更新与定时任务并发</w:t>
             </w:r>
           </w:p>
         </w:tc>
@@ -6634,7 +6649,7 @@
                 <w:color w:val="243447"/>
                 <w:sz w:val="16"/>
               </w:rPr>
-              <w:t>保留记录但不标记已匹配。</w:t>
+              <w:t>复用进行中任务或通过互斥锁避免重复推进游标。</w:t>
             </w:r>
           </w:p>
         </w:tc>
@@ -6667,7 +6682,7 @@
                 <w:color w:val="243447"/>
                 <w:sz w:val="16"/>
               </w:rPr>
-              <w:t>提示旺店通返回字段不完整。</w:t>
+              <w:t>按钮显示更新中或提示稍后重试。</w:t>
             </w:r>
           </w:p>
         </w:tc>
@@ -6705,7 +6720,7 @@
                 <w:color w:val="243447"/>
                 <w:sz w:val="16"/>
               </w:rPr>
-              <w:t>同一关系后续被旺店通更新</w:t>
+              <w:t>合单关联其他OMS发货单</w:t>
             </w:r>
           </w:p>
         </w:tc>
@@ -6738,7 +6753,7 @@
                 <w:color w:val="243447"/>
                 <w:sz w:val="16"/>
               </w:rPr>
-              <w:t>按更新时间生成新版本或更新当前版本，并保留历史快照。</w:t>
+              <w:t>同一合单记录分别挂载到所有已匹配原发货单。</w:t>
             </w:r>
           </w:p>
         </w:tc>
@@ -6771,215 +6786,7 @@
                 <w:color w:val="243447"/>
                 <w:sz w:val="16"/>
               </w:rPr>
-              <w:t>详情展示最近更新时间。</w:t>
-            </w:r>
-          </w:p>
-        </w:tc>
-      </w:tr>
-      <w:tr>
-        <w:trPr>
-          <w:cantSplit/>
-        </w:trPr>
-        <w:tc>
-          <w:tcPr>
-            <w:tcW w:type="dxa" w:w="2500"/>
-            <w:tcMar>
-              <w:top w:w="80" w:type="dxa"/>
-              <w:start w:w="120" w:type="dxa"/>
-              <w:bottom w:w="80" w:type="dxa"/>
-              <w:end w:w="120" w:type="dxa"/>
-            </w:tcMar>
-            <w:vAlign w:val="center"/>
-          </w:tcPr>
-          <w:p>
-            <w:pPr>
-              <w:spacing w:before="0" w:after="20" w:line="259" w:lineRule="auto"/>
-            </w:pPr>
-            <w:r>
-              <w:rPr>
-                <w:rFonts w:ascii="Microsoft YaHei" w:hAnsi="Microsoft YaHei" w:eastAsia="Microsoft YaHei"/>
-                <w:color w:val="243447"/>
-                <w:sz w:val="16"/>
-              </w:rPr>
-            </w:r>
-            <w:r>
-              <w:rPr>
-                <w:rFonts w:ascii="Microsoft YaHei" w:hAnsi="Microsoft YaHei" w:eastAsia="Microsoft YaHei"/>
-                <w:b w:val="0"/>
-                <w:color w:val="243447"/>
-                <w:sz w:val="16"/>
-              </w:rPr>
-              <w:t>定时任务与人工拉取并发</w:t>
-            </w:r>
-          </w:p>
-        </w:tc>
-        <w:tc>
-          <w:tcPr>
-            <w:tcW w:type="dxa" w:w="4450"/>
-            <w:tcMar>
-              <w:top w:w="80" w:type="dxa"/>
-              <w:start w:w="120" w:type="dxa"/>
-              <w:bottom w:w="80" w:type="dxa"/>
-              <w:end w:w="120" w:type="dxa"/>
-            </w:tcMar>
-            <w:vAlign w:val="center"/>
-          </w:tcPr>
-          <w:p>
-            <w:pPr>
-              <w:spacing w:before="0" w:after="20" w:line="259" w:lineRule="auto"/>
-            </w:pPr>
-            <w:r>
-              <w:rPr>
-                <w:rFonts w:ascii="Microsoft YaHei" w:hAnsi="Microsoft YaHei" w:eastAsia="Microsoft YaHei"/>
-                <w:color w:val="243447"/>
-                <w:sz w:val="16"/>
-              </w:rPr>
-            </w:r>
-            <w:r>
-              <w:rPr>
-                <w:rFonts w:ascii="Microsoft YaHei" w:hAnsi="Microsoft YaHei" w:eastAsia="Microsoft YaHei"/>
-                <w:b w:val="0"/>
-                <w:color w:val="243447"/>
-                <w:sz w:val="16"/>
-              </w:rPr>
-              <w:t>通过任务互斥或共享幂等键避免重复推进水位。</w:t>
-            </w:r>
-          </w:p>
-        </w:tc>
-        <w:tc>
-          <w:tcPr>
-            <w:tcW w:type="dxa" w:w="2410"/>
-            <w:tcMar>
-              <w:top w:w="80" w:type="dxa"/>
-              <w:start w:w="120" w:type="dxa"/>
-              <w:bottom w:w="80" w:type="dxa"/>
-              <w:end w:w="120" w:type="dxa"/>
-            </w:tcMar>
-            <w:vAlign w:val="center"/>
-          </w:tcPr>
-          <w:p>
-            <w:pPr>
-              <w:spacing w:before="0" w:after="20" w:line="259" w:lineRule="auto"/>
-            </w:pPr>
-            <w:r>
-              <w:rPr>
-                <w:rFonts w:ascii="Microsoft YaHei" w:hAnsi="Microsoft YaHei" w:eastAsia="Microsoft YaHei"/>
-                <w:color w:val="243447"/>
-                <w:sz w:val="16"/>
-              </w:rPr>
-            </w:r>
-            <w:r>
-              <w:rPr>
-                <w:rFonts w:ascii="Microsoft YaHei" w:hAnsi="Microsoft YaHei" w:eastAsia="Microsoft YaHei"/>
-                <w:b w:val="0"/>
-                <w:color w:val="243447"/>
-                <w:sz w:val="16"/>
-              </w:rPr>
-              <w:t>后发任务复用进行中任务或提示稍后重试。</w:t>
-            </w:r>
-          </w:p>
-        </w:tc>
-      </w:tr>
-      <w:tr>
-        <w:trPr>
-          <w:cantSplit/>
-        </w:trPr>
-        <w:tc>
-          <w:tcPr>
-            <w:tcW w:type="dxa" w:w="2500"/>
-            <w:tcMar>
-              <w:top w:w="80" w:type="dxa"/>
-              <w:start w:w="120" w:type="dxa"/>
-              <w:bottom w:w="80" w:type="dxa"/>
-              <w:end w:w="120" w:type="dxa"/>
-            </w:tcMar>
-            <w:vAlign w:val="center"/>
-          </w:tcPr>
-          <w:p>
-            <w:pPr>
-              <w:spacing w:before="0" w:after="20" w:line="259" w:lineRule="auto"/>
-            </w:pPr>
-            <w:r>
-              <w:rPr>
-                <w:rFonts w:ascii="Microsoft YaHei" w:hAnsi="Microsoft YaHei" w:eastAsia="Microsoft YaHei"/>
-                <w:color w:val="243447"/>
-                <w:sz w:val="16"/>
-              </w:rPr>
-            </w:r>
-            <w:r>
-              <w:rPr>
-                <w:rFonts w:ascii="Microsoft YaHei" w:hAnsi="Microsoft YaHei" w:eastAsia="Microsoft YaHei"/>
-                <w:b w:val="0"/>
-                <w:color w:val="243447"/>
-                <w:sz w:val="16"/>
-              </w:rPr>
-              <w:t>重新匹配仍缺少标识</w:t>
-            </w:r>
-          </w:p>
-        </w:tc>
-        <w:tc>
-          <w:tcPr>
-            <w:tcW w:type="dxa" w:w="4450"/>
-            <w:tcMar>
-              <w:top w:w="80" w:type="dxa"/>
-              <w:start w:w="120" w:type="dxa"/>
-              <w:bottom w:w="80" w:type="dxa"/>
-              <w:end w:w="120" w:type="dxa"/>
-            </w:tcMar>
-            <w:vAlign w:val="center"/>
-          </w:tcPr>
-          <w:p>
-            <w:pPr>
-              <w:spacing w:before="0" w:after="20" w:line="259" w:lineRule="auto"/>
-            </w:pPr>
-            <w:r>
-              <w:rPr>
-                <w:rFonts w:ascii="Microsoft YaHei" w:hAnsi="Microsoft YaHei" w:eastAsia="Microsoft YaHei"/>
-                <w:color w:val="243447"/>
-                <w:sz w:val="16"/>
-              </w:rPr>
-            </w:r>
-            <w:r>
-              <w:rPr>
-                <w:rFonts w:ascii="Microsoft YaHei" w:hAnsi="Microsoft YaHei" w:eastAsia="Microsoft YaHei"/>
-                <w:b w:val="0"/>
-                <w:color w:val="243447"/>
-                <w:sz w:val="16"/>
-              </w:rPr>
-              <w:t>保留待匹配状态和本次失败原因。</w:t>
-            </w:r>
-          </w:p>
-        </w:tc>
-        <w:tc>
-          <w:tcPr>
-            <w:tcW w:type="dxa" w:w="2410"/>
-            <w:tcMar>
-              <w:top w:w="80" w:type="dxa"/>
-              <w:start w:w="120" w:type="dxa"/>
-              <w:bottom w:w="80" w:type="dxa"/>
-              <w:end w:w="120" w:type="dxa"/>
-            </w:tcMar>
-            <w:vAlign w:val="center"/>
-          </w:tcPr>
-          <w:p>
-            <w:pPr>
-              <w:spacing w:before="0" w:after="20" w:line="259" w:lineRule="auto"/>
-            </w:pPr>
-            <w:r>
-              <w:rPr>
-                <w:rFonts w:ascii="Microsoft YaHei" w:hAnsi="Microsoft YaHei" w:eastAsia="Microsoft YaHei"/>
-                <w:color w:val="243447"/>
-                <w:sz w:val="16"/>
-              </w:rPr>
-            </w:r>
-            <w:r>
-              <w:rPr>
-                <w:rFonts w:ascii="Microsoft YaHei" w:hAnsi="Microsoft YaHei" w:eastAsia="Microsoft YaHei"/>
-                <w:b w:val="0"/>
-                <w:color w:val="243447"/>
-                <w:sz w:val="16"/>
-              </w:rPr>
-              <w:t>输入不丢失，提示检查旺店通接口字段。</w:t>
+              <w:t>当前详情列出其他来源单，但列表仍各自保留原记录。</w:t>
             </w:r>
           </w:p>
         </w:tc>
@@ -7020,7 +6827,7 @@
           <w:color w:val="243447"/>
           <w:sz w:val="20"/>
         </w:rPr>
-        <w:t>发货人员继续在旺店通执行拆单和合单，不再进入OMS操作拆合。</w:t>
+        <w:t>发货人员继续按现有方式在OMS生成一张发货单并同步旺店通。</w:t>
       </w:r>
     </w:p>
     <w:p>
@@ -7035,7 +6842,7 @@
           <w:color w:val="243447"/>
           <w:sz w:val="20"/>
         </w:rPr>
-        <w:t>OMS新增旺店通拆合单同步页面，用于确认数据是否已拉取、是否匹配和数量是否完整。</w:t>
+        <w:t>拆单和合单继续在旺店通执行，OMS发货管理不新增拆合操作。</w:t>
       </w:r>
     </w:p>
     <w:p>
@@ -7050,7 +6857,7 @@
           <w:color w:val="243447"/>
           <w:sz w:val="20"/>
         </w:rPr>
-        <w:t>未匹配数据需要接口标识补齐或人工核对，不能直接用于物流、售后和退货定位。</w:t>
+        <w:t>旺店通处理完成后，业务人员回到原发货单点击“查看拆合单记录”追溯执行结果。</w:t>
       </w:r>
     </w:p>
     <w:p>
@@ -7065,7 +6872,22 @@
           <w:color w:val="243447"/>
           <w:sz w:val="20"/>
         </w:rPr>
-        <w:t>客服、售后和物流查询改为沿拉取后的拆合关系定位旺店通实际结果单。</w:t>
+        <w:t>发货管理列表、统计和导出口径继续按OMS原发货单计算，不能按旺店通结果单增加记录数。</w:t>
+      </w:r>
+    </w:p>
+    <w:p>
+      <w:pPr>
+        <w:pStyle w:val="ListBullet"/>
+        <w:spacing w:after="80" w:line="280" w:lineRule="auto"/>
+        <w:ind w:left="720" w:hanging="360"/>
+      </w:pPr>
+      <w:r>
+        <w:rPr>
+          <w:rFonts w:ascii="Microsoft YaHei" w:hAnsi="Microsoft YaHei" w:eastAsia="Microsoft YaHei"/>
+          <w:color w:val="243447"/>
+          <w:sz w:val="20"/>
+        </w:rPr>
+        <w:t>客服、售后和退货可从原发货单沿拆合记录定位实际旺店通单号和商品数量。</w:t>
       </w:r>
     </w:p>
     <w:p>
@@ -7232,7 +7054,7 @@
                 <w:color w:val="243447"/>
                 <w:sz w:val="17"/>
               </w:rPr>
-              <w:t>新增拉取批次、拆合记录、来源单、结果单、商品行数量映射、原始响应和匹配结果。</w:t>
+              <w:t>在现有发货单外新增拆合记录、来源单、结果单、商品行数量、原始响应和匹配结果关系表。</w:t>
             </w:r>
           </w:p>
         </w:tc>
@@ -7303,7 +7125,7 @@
                 <w:color w:val="243447"/>
                 <w:sz w:val="17"/>
               </w:rPr>
-              <w:t>新增定时增量拉取、人工拉取、分页重试、水位管理和接口限流处理。</w:t>
+              <w:t>新增定时增量拉取、人工更新、分页重试、水位管理和限流处理。</w:t>
             </w:r>
           </w:p>
         </w:tc>
@@ -7341,7 +7163,7 @@
                 <w:color w:val="243447"/>
                 <w:sz w:val="17"/>
               </w:rPr>
-              <w:t>订单映射</w:t>
+              <w:t>发货管理列表</w:t>
             </w:r>
           </w:p>
         </w:tc>
@@ -7374,7 +7196,7 @@
                 <w:color w:val="243447"/>
                 <w:sz w:val="17"/>
               </w:rPr>
-              <w:t>增强旺店通单号与OMS发货单、原订单商品行的映射能力。</w:t>
+              <w:t>不新增拆合结果行；增加拆合摘要、旺店通单号查询和查看记录入口。</w:t>
             </w:r>
           </w:p>
         </w:tc>
@@ -7412,7 +7234,7 @@
                 <w:color w:val="243447"/>
                 <w:sz w:val="17"/>
               </w:rPr>
-              <w:t>发货管理页面</w:t>
+              <w:t>发货单详情</w:t>
             </w:r>
           </w:p>
         </w:tc>
@@ -7445,7 +7267,7 @@
                 <w:color w:val="243447"/>
                 <w:sz w:val="17"/>
               </w:rPr>
-              <w:t>新增拆合数据同步列表、筛选、关系详情和待匹配异常池；移除新版本中的OMS拆合操作。</w:t>
+              <w:t>增加只读拆合时间线，先展示原记录，再展示旺店通处理结果。</w:t>
             </w:r>
           </w:p>
         </w:tc>
@@ -7483,7 +7305,7 @@
                 <w:color w:val="243447"/>
                 <w:sz w:val="17"/>
               </w:rPr>
-              <w:t>物流与售后</w:t>
+              <w:t>统计与导出</w:t>
             </w:r>
           </w:p>
         </w:tc>
@@ -7516,7 +7338,7 @@
                 <w:color w:val="243447"/>
                 <w:sz w:val="17"/>
               </w:rPr>
-              <w:t>读取叶子结果单和商品来源数量；异常关系不得进入自动处理。</w:t>
+              <w:t>仍按OMS发货单主键去重统计；拆合明细仅在需要时单独导出。</w:t>
             </w:r>
           </w:p>
         </w:tc>
@@ -7554,7 +7376,7 @@
                 <w:color w:val="243447"/>
                 <w:sz w:val="17"/>
               </w:rPr>
-              <w:t>监控</w:t>
+              <w:t>物流与售后</w:t>
             </w:r>
           </w:p>
         </w:tc>
@@ -7587,7 +7409,78 @@
                 <w:color w:val="243447"/>
                 <w:sz w:val="17"/>
               </w:rPr>
-              <w:t>增加拉取延迟、批次失败、未匹配数量、数量异常和映射冲突告警。</w:t>
+              <w:t>从原发货单关系链读取当前旺店通结果单；异常关系不得进入自动处理。</w:t>
+            </w:r>
+          </w:p>
+        </w:tc>
+      </w:tr>
+      <w:tr>
+        <w:trPr>
+          <w:cantSplit/>
+        </w:trPr>
+        <w:tc>
+          <w:tcPr>
+            <w:tcW w:type="dxa" w:w="2300"/>
+            <w:tcMar>
+              <w:top w:w="80" w:type="dxa"/>
+              <w:start w:w="120" w:type="dxa"/>
+              <w:bottom w:w="80" w:type="dxa"/>
+              <w:end w:w="120" w:type="dxa"/>
+            </w:tcMar>
+            <w:vAlign w:val="center"/>
+          </w:tcPr>
+          <w:p>
+            <w:pPr>
+              <w:spacing w:before="0" w:after="20" w:line="259" w:lineRule="auto"/>
+            </w:pPr>
+            <w:r>
+              <w:rPr>
+                <w:rFonts w:ascii="Microsoft YaHei" w:hAnsi="Microsoft YaHei" w:eastAsia="Microsoft YaHei"/>
+                <w:color w:val="243447"/>
+                <w:sz w:val="17"/>
+              </w:rPr>
+            </w:r>
+            <w:r>
+              <w:rPr>
+                <w:rFonts w:ascii="Microsoft YaHei" w:hAnsi="Microsoft YaHei" w:eastAsia="Microsoft YaHei"/>
+                <w:b w:val="0"/>
+                <w:color w:val="243447"/>
+                <w:sz w:val="17"/>
+              </w:rPr>
+              <w:t>监控</w:t>
+            </w:r>
+          </w:p>
+        </w:tc>
+        <w:tc>
+          <w:tcPr>
+            <w:tcW w:type="dxa" w:w="7060"/>
+            <w:tcMar>
+              <w:top w:w="80" w:type="dxa"/>
+              <w:start w:w="120" w:type="dxa"/>
+              <w:bottom w:w="80" w:type="dxa"/>
+              <w:end w:w="120" w:type="dxa"/>
+            </w:tcMar>
+            <w:vAlign w:val="center"/>
+          </w:tcPr>
+          <w:p>
+            <w:pPr>
+              <w:spacing w:before="0" w:after="20" w:line="259" w:lineRule="auto"/>
+            </w:pPr>
+            <w:r>
+              <w:rPr>
+                <w:rFonts w:ascii="Microsoft YaHei" w:hAnsi="Microsoft YaHei" w:eastAsia="Microsoft YaHei"/>
+                <w:color w:val="243447"/>
+                <w:sz w:val="17"/>
+              </w:rPr>
+            </w:r>
+            <w:r>
+              <w:rPr>
+                <w:rFonts w:ascii="Microsoft YaHei" w:hAnsi="Microsoft YaHei" w:eastAsia="Microsoft YaHei"/>
+                <w:b w:val="0"/>
+                <w:color w:val="243447"/>
+                <w:sz w:val="17"/>
+              </w:rPr>
+              <w:t>增加拉取失败、未匹配、数量异常、映射冲突和关系积压告警。</w:t>
             </w:r>
           </w:p>
         </w:tc>
@@ -7614,7 +7507,7 @@
           <w:color w:val="243447"/>
           <w:sz w:val="20"/>
         </w:rPr>
-        <w:t>先完成旺店通接口字段和历史数据范围确认，并在测试环境验证拆单、合单、多级拆合样例。</w:t>
+        <w:t>确认旺店通拆合接口字段，并准备拆单、合单、先拆后合和多发货单合并样例。</w:t>
       </w:r>
     </w:p>
     <w:p>
@@ -7629,7 +7522,7 @@
           <w:color w:val="243447"/>
           <w:sz w:val="20"/>
         </w:rPr>
-        <w:t>上线数据表与拉取任务，先只记录不供下游消费，核对数量守恒和匹配准确性。</w:t>
+        <w:t>先上线关系表和拉取任务，验证不会改变现有发货单记录数、编号和状态。</w:t>
       </w:r>
     </w:p>
     <w:p>
@@ -7644,7 +7537,7 @@
           <w:color w:val="243447"/>
           <w:sz w:val="20"/>
         </w:rPr>
-        <w:t>灰度开放查询页面和待匹配处理，完成历史存量数据初始化。</w:t>
+        <w:t>灰度开放发货管理的拆合摘要与详情入口，抽查旺店通数量和单号关系。</w:t>
       </w:r>
     </w:p>
     <w:p>
@@ -7659,7 +7552,7 @@
           <w:color w:val="243447"/>
           <w:sz w:val="20"/>
         </w:rPr>
-        <w:t>匹配结果稳定后，再切换物流、售后和退货模块读取新关系。</w:t>
+        <w:t>确认统计、导出、物流、售后和退货均以OMS原发货单为主口径后再全量发布。</w:t>
       </w:r>
     </w:p>
     <w:p>
@@ -7674,7 +7567,7 @@
           <w:color w:val="243447"/>
           <w:sz w:val="20"/>
         </w:rPr>
-        <w:t>回滚时停止新拉取任务并恢复下游旧查询逻辑，但保留已拉取原始数据和关系记录。</w:t>
+        <w:t>回滚时关闭新的关系展示和拉取任务，保留已拉取原始数据，不删除原发货单。</w:t>
       </w:r>
     </w:p>
     <w:p>
@@ -7951,7 +7844,7 @@
                 <w:color w:val="243447"/>
                 <w:sz w:val="16"/>
               </w:rPr>
-              <w:t>提供记录唯一ID、更新时间、拆合类型、来源单、结果单、商品行和数量；确认分页、限流、历史查询和更新机制。</w:t>
+              <w:t>提供记录ID、更新时间、来源单、结果单、商品行、数量及可反查OMS原发货单的稳定标识。</w:t>
             </w:r>
           </w:p>
         </w:tc>
@@ -8055,7 +7948,7 @@
                 <w:color w:val="243447"/>
                 <w:sz w:val="16"/>
               </w:rPr>
-              <w:t>拉取任务与关系模型</w:t>
+              <w:t>关系模型与拉取任务</w:t>
             </w:r>
           </w:p>
         </w:tc>
@@ -8088,7 +7981,7 @@
                 <w:color w:val="243447"/>
                 <w:sz w:val="16"/>
               </w:rPr>
-              <w:t>实现批次、水位、幂等、分页重试、原始响应、关系入库和匹配服务。</w:t>
+              <w:t>实现游标、幂等、分页重试、主记录匹配、历史挂载和异常隔离。</w:t>
             </w:r>
           </w:p>
         </w:tc>
@@ -8192,7 +8085,7 @@
                 <w:color w:val="243447"/>
                 <w:sz w:val="16"/>
               </w:rPr>
-              <w:t>同步页面与异常池</w:t>
+              <w:t>发货管理改造</w:t>
             </w:r>
           </w:p>
         </w:tc>
@@ -8225,7 +8118,7 @@
                 <w:color w:val="243447"/>
                 <w:sz w:val="16"/>
               </w:rPr>
-              <w:t>实现筛选、Tab、立即拉取、关系详情、失败反馈和重新匹配。</w:t>
+              <w:t>保持原列表一条主记录，增加拆合摘要、查询、详情时间线及更新反馈。</w:t>
             </w:r>
           </w:p>
         </w:tc>
@@ -8329,7 +8222,7 @@
                 <w:color w:val="243447"/>
                 <w:sz w:val="16"/>
               </w:rPr>
-              <w:t>稳定业务标识</w:t>
+              <w:t>稳定主键与统计口径</w:t>
             </w:r>
           </w:p>
         </w:tc>
@@ -8362,7 +8255,7 @@
                 <w:color w:val="243447"/>
                 <w:sz w:val="16"/>
               </w:rPr>
-              <w:t>提供OMS发货单唯一ID、同步请求号和旺店通单号既有映射。</w:t>
+              <w:t>保证拆合结果不生成新发货单，并提供原同步请求号和旺店通原单映射。</w:t>
             </w:r>
           </w:p>
         </w:tc>
@@ -8466,7 +8359,7 @@
                 <w:color w:val="243447"/>
                 <w:sz w:val="16"/>
               </w:rPr>
-              <w:t>下游读取规则</w:t>
+              <w:t>结果单读取规则</w:t>
             </w:r>
           </w:p>
         </w:tc>
@@ -8499,7 +8392,7 @@
                 <w:color w:val="243447"/>
                 <w:sz w:val="16"/>
               </w:rPr>
-              <w:t>确认叶子结果单、原订单商品行和数量来源的消费方式及异常阻断规则。</w:t>
+              <w:t>从OMS原发货单沿关系链读取当前旺店通执行单，并定义异常阻断规则。</w:t>
             </w:r>
           </w:p>
         </w:tc>
@@ -8603,7 +8496,7 @@
                 <w:color w:val="243447"/>
                 <w:sz w:val="16"/>
               </w:rPr>
-              <w:t>历史范围与异常处理</w:t>
+              <w:t>页面验收样例</w:t>
             </w:r>
           </w:p>
         </w:tc>
@@ -8636,7 +8529,7 @@
                 <w:color w:val="243447"/>
                 <w:sz w:val="16"/>
               </w:rPr>
-              <w:t>确认历史数据起始时间、人工核对责任和验收样例。</w:t>
+              <w:t>确认一张发货单拆分、跨单合并和先拆后合的展示方式。</w:t>
             </w:r>
           </w:p>
         </w:tc>
@@ -8740,7 +8633,7 @@
                 <w:color w:val="243447"/>
                 <w:sz w:val="16"/>
               </w:rPr>
-              <w:t>端到端数据测试</w:t>
+              <w:t>端到端测试</w:t>
             </w:r>
           </w:p>
         </w:tc>
@@ -8773,7 +8666,7 @@
                 <w:color w:val="243447"/>
                 <w:sz w:val="16"/>
               </w:rPr>
-              <w:t>覆盖拆单、合单、多级关系、重复拉取、分页失败、乱序、未匹配、数量异常和并发任务。</w:t>
+              <w:t>覆盖记录数不变、重复拉取、跨单查询、乱序、未匹配、数量异常和并发任务。</w:t>
             </w:r>
           </w:p>
         </w:tc>
@@ -8877,7 +8770,7 @@
                 <w:color w:val="243447"/>
                 <w:sz w:val="16"/>
               </w:rPr>
-              <w:t>任务调度和告警</w:t>
+              <w:t>调度与告警</w:t>
             </w:r>
           </w:p>
         </w:tc>
@@ -8910,7 +8803,7 @@
                 <w:color w:val="243447"/>
                 <w:sz w:val="16"/>
               </w:rPr>
-              <w:t>配置任务执行、失败重试、接口延迟、未匹配积压和数据异常告警。</w:t>
+              <w:t>配置任务执行、接口失败、未匹配积压和数据异常告警。</w:t>
             </w:r>
           </w:p>
         </w:tc>
@@ -8970,7 +8863,7 @@
           <w:color w:val="243447"/>
           <w:sz w:val="20"/>
         </w:rPr>
-        <w:t>旺店通拆合记录的唯一ID、更新时间精度及同一时间多条数据的排序字段。</w:t>
+        <w:t>旺店通拆合记录是否能返回OMS发货单唯一ID、原同步请求号或可稳定反查的原单号。</w:t>
       </w:r>
     </w:p>
     <w:p>
@@ -8985,7 +8878,7 @@
           <w:color w:val="243447"/>
           <w:sz w:val="20"/>
         </w:rPr>
-        <w:t>来源单和结果单是否同时返回OMS业务标识、原同步请求号或可稳定反查的旺店通单号。</w:t>
+        <w:t>拆单和合单记录的唯一ID、更新时间精度、分页方式和同一时间多条数据的排序字段。</w:t>
       </w:r>
     </w:p>
     <w:p>
@@ -9000,7 +8893,7 @@
           <w:color w:val="243447"/>
           <w:sz w:val="20"/>
         </w:rPr>
-        <w:t>拆单和合单商品行的SKU、规格、单位、数量及同一SKU合并规则。</w:t>
+        <w:t>合单涉及多张OMS发货单时，接口是否返回全部来源单和各来源商品数量。</w:t>
       </w:r>
     </w:p>
     <w:p>
@@ -9015,7 +8908,7 @@
           <w:color w:val="243447"/>
           <w:sz w:val="20"/>
         </w:rPr>
-        <w:t>记录是否可能修改、撤销或删除，以及历史版本和最终状态的查询方式。</w:t>
+        <w:t>结果单再次拆合时，接口如何表达上游记录和当前最终结果单。</w:t>
       </w:r>
     </w:p>
     <w:p>
@@ -9030,7 +8923,7 @@
           <w:color w:val="243447"/>
           <w:sz w:val="20"/>
         </w:rPr>
-        <w:t>接口分页上限、频率限制、可查询历史范围和失败重试建议。</w:t>
+        <w:t>原发货单统计、导出、物流、售后和退货是否统一以OMS发货单主键去重。</w:t>
       </w:r>
     </w:p>
     <w:p>
@@ -9045,7 +8938,7 @@
           <w:color w:val="243447"/>
           <w:sz w:val="20"/>
         </w:rPr>
-        <w:t>上线时需要初始化的历史时间范围，以及存量关系的验收抽样方式。</w:t>
+        <w:t>历史数据初始化范围，以及上线前后发货单记录数不变的核对方式。</w:t>
       </w:r>
     </w:p>
     <w:sectPr>

</xml_diff>

<commit_message>
Auto sync 2026-10-26 11:37:47
</commit_message>
<xml_diff>
--- a/04-需求管理/PRD-OMS拉取旺店通拆合单数据-v1.0.docx
+++ b/04-需求管理/PRD-OMS拉取旺店通拆合单数据-v1.0.docx
@@ -14,7 +14,7 @@
           <w:color w:val="000000"/>
           <w:sz w:val="50"/>
         </w:rPr>
-        <w:t>OMS发货管理展示旺店通拆合记录</w:t>
+        <w:t>OMS发货管理与旺店通拆合单管理</w:t>
       </w:r>
     </w:p>
     <w:p>
@@ -637,7 +637,7 @@
           <w:color w:val="243447"/>
           <w:sz w:val="21"/>
         </w:rPr>
-        <w:t>OMS发货管理继续以原始发货单为唯一主记录。原始发货单以一条数据同步至旺店通；旺店通完成拆单或合单后，OMS拉取处理结果并作为该发货单下的只读历史展示，不新增、拆分、合并或替换OMS发货单。</w:t>
+        <w:t>OMS发货管理继续以原始发货单为唯一主记录；拆/合单管理独立集中展示旺店通返回的被拆合订单数据。两个页面读取同一套拆合关系：前者保证发货主单稳定，后者提供处理前订单、处理后订单和商品数量的集中查询。</w:t>
       </w:r>
     </w:p>
     <w:p>
@@ -674,7 +674,7 @@
           <w:color w:val="243447"/>
           <w:sz w:val="21"/>
         </w:rPr>
-        <w:t>此前拉取方案将旺店通拆合结果设计成独立列表，并可能让用户误以为结果单对应新的OMS发货单。现明确：发货管理列表仍只展示原始发货单；拆合记录、旺店通结果单号和商品数量变化只在该发货单的“查看拆合单记录”中展示。</w:t>
+        <w:t>发货管理与拆合业务查询存在不同目标：发货管理需要维持OMS原始发货单口径，拆合业务人员则需要集中查看所有被旺店通拆单或合单的订单。因此系统保留两个入口：发货管理中从原发货单查看关联记录，拆/合单管理中按拆合事件查看处理前后订单数据。</w:t>
       </w:r>
     </w:p>
     <w:p>
@@ -746,6 +746,30 @@
           <w:sz w:val="20"/>
         </w:rPr>
         <w:t>从原发货单直接查看旺店通拆单、合单的来源单、结果单、商品及数量。</w:t>
+      </w:r>
+    </w:p>
+    <w:p>
+      <w:pPr>
+        <w:pStyle w:val="ListBullet"/>
+        <w:spacing w:after="80" w:line="280" w:lineRule="auto"/>
+        <w:ind w:left="720" w:hanging="360"/>
+      </w:pPr>
+      <w:r>
+        <w:rPr>
+          <w:rFonts w:ascii="Microsoft YaHei" w:hAnsi="Microsoft YaHei" w:eastAsia="Microsoft YaHei"/>
+          <w:b/>
+          <w:color w:val="243447"/>
+          <w:sz w:val="20"/>
+        </w:rPr>
+        <w:t>集中可查询：</w:t>
+      </w:r>
+      <w:r>
+        <w:rPr>
+          <w:rFonts w:ascii="Microsoft YaHei" w:hAnsi="Microsoft YaHei" w:eastAsia="Microsoft YaHei"/>
+          <w:color w:val="243447"/>
+          <w:sz w:val="20"/>
+        </w:rPr>
+        <w:t>通过拆/合单管理统一查看全部被旺店通拆合的订单数据。</w:t>
       </w:r>
     </w:p>
     <w:p>
@@ -840,7 +864,7 @@
           <w:color w:val="243447"/>
           <w:sz w:val="21"/>
         </w:rPr>
-        <w:t>同一OMS发货单在发货管理列表中始终只有一条；拆合数据拉取成功后，可在该发货单详情中查看完整旺店通处理历史，并能从结果单回溯原始发货单。</w:t>
+        <w:t>同一OMS发货单在发货管理列表中始终只有一条；拆合数据拉取成功后，可从原发货单查看处理历史，也可在拆/合单管理中查询全部被拆合订单，并能从结果单回溯原始发货单。</w:t>
       </w:r>
     </w:p>
     <w:p>
@@ -1355,7 +1379,7 @@
                 <w:color w:val="243447"/>
                 <w:sz w:val="17"/>
               </w:rPr>
-              <w:t>独立拆合列表增加理解成本，主单和执行单口径不统一。</w:t>
+              <w:t>仅在单张发货单内查看记录，不便集中掌握所有被拆合订单。</w:t>
             </w:r>
           </w:p>
         </w:tc>
@@ -1388,7 +1412,7 @@
                 <w:color w:val="243447"/>
                 <w:sz w:val="17"/>
               </w:rPr>
-              <w:t>以OMS原发货单为统一入口，旺店通数据作为从属历史。</w:t>
+              <w:t>在拆/合单管理集中查看，同时保持发货主单口径不变。</w:t>
             </w:r>
           </w:p>
         </w:tc>
@@ -2095,6 +2119,214 @@
                 <w:color w:val="243447"/>
                 <w:sz w:val="17"/>
               </w:rPr>
+              <w:t>拆/合单管理</w:t>
+            </w:r>
+          </w:p>
+        </w:tc>
+        <w:tc>
+          <w:tcPr>
+            <w:tcW w:type="dxa" w:w="5000"/>
+            <w:tcMar>
+              <w:top w:w="80" w:type="dxa"/>
+              <w:start w:w="120" w:type="dxa"/>
+              <w:bottom w:w="80" w:type="dxa"/>
+              <w:end w:w="120" w:type="dxa"/>
+            </w:tcMar>
+            <w:vAlign w:val="center"/>
+          </w:tcPr>
+          <w:p>
+            <w:pPr>
+              <w:spacing w:before="0" w:after="20" w:line="259" w:lineRule="auto"/>
+            </w:pPr>
+            <w:r>
+              <w:rPr>
+                <w:rFonts w:ascii="Microsoft YaHei" w:hAnsi="Microsoft YaHei" w:eastAsia="Microsoft YaHei"/>
+                <w:color w:val="243447"/>
+                <w:sz w:val="17"/>
+              </w:rPr>
+            </w:r>
+            <w:r>
+              <w:rPr>
+                <w:rFonts w:ascii="Microsoft YaHei" w:hAnsi="Microsoft YaHei" w:eastAsia="Microsoft YaHei"/>
+                <w:b w:val="0"/>
+                <w:color w:val="243447"/>
+                <w:sz w:val="17"/>
+              </w:rPr>
+              <w:t>按拆合事件集中展示被处理的订单；支持全部、拆单、合单Tab及条件查询。</w:t>
+            </w:r>
+          </w:p>
+        </w:tc>
+        <w:tc>
+          <w:tcPr>
+            <w:tcW w:type="dxa" w:w="2610"/>
+            <w:tcMar>
+              <w:top w:w="80" w:type="dxa"/>
+              <w:start w:w="120" w:type="dxa"/>
+              <w:bottom w:w="80" w:type="dxa"/>
+              <w:end w:w="120" w:type="dxa"/>
+            </w:tcMar>
+            <w:vAlign w:val="center"/>
+          </w:tcPr>
+          <w:p>
+            <w:pPr>
+              <w:spacing w:before="0" w:after="20" w:line="259" w:lineRule="auto"/>
+            </w:pPr>
+            <w:r>
+              <w:rPr>
+                <w:rFonts w:ascii="Microsoft YaHei" w:hAnsi="Microsoft YaHei" w:eastAsia="Microsoft YaHei"/>
+                <w:color w:val="243447"/>
+                <w:sz w:val="17"/>
+              </w:rPr>
+            </w:r>
+            <w:r>
+              <w:rPr>
+                <w:rFonts w:ascii="Microsoft YaHei" w:hAnsi="Microsoft YaHei" w:eastAsia="Microsoft YaHei"/>
+                <w:b w:val="0"/>
+                <w:color w:val="243447"/>
+                <w:sz w:val="17"/>
+              </w:rPr>
+              <w:t>独立菜单页面</w:t>
+            </w:r>
+          </w:p>
+        </w:tc>
+      </w:tr>
+      <w:tr>
+        <w:trPr>
+          <w:cantSplit/>
+        </w:trPr>
+        <w:tc>
+          <w:tcPr>
+            <w:tcW w:type="dxa" w:w="1750"/>
+            <w:tcMar>
+              <w:top w:w="80" w:type="dxa"/>
+              <w:start w:w="120" w:type="dxa"/>
+              <w:bottom w:w="80" w:type="dxa"/>
+              <w:end w:w="120" w:type="dxa"/>
+            </w:tcMar>
+            <w:vAlign w:val="center"/>
+          </w:tcPr>
+          <w:p>
+            <w:pPr>
+              <w:spacing w:before="0" w:after="20" w:line="259" w:lineRule="auto"/>
+            </w:pPr>
+            <w:r>
+              <w:rPr>
+                <w:rFonts w:ascii="Microsoft YaHei" w:hAnsi="Microsoft YaHei" w:eastAsia="Microsoft YaHei"/>
+                <w:color w:val="243447"/>
+                <w:sz w:val="17"/>
+              </w:rPr>
+            </w:r>
+            <w:r>
+              <w:rPr>
+                <w:rFonts w:ascii="Microsoft YaHei" w:hAnsi="Microsoft YaHei" w:eastAsia="Microsoft YaHei"/>
+                <w:b w:val="0"/>
+                <w:color w:val="243447"/>
+                <w:sz w:val="17"/>
+              </w:rPr>
+              <w:t>拆合订单卡片</w:t>
+            </w:r>
+          </w:p>
+        </w:tc>
+        <w:tc>
+          <w:tcPr>
+            <w:tcW w:type="dxa" w:w="5000"/>
+            <w:tcMar>
+              <w:top w:w="80" w:type="dxa"/>
+              <w:start w:w="120" w:type="dxa"/>
+              <w:bottom w:w="80" w:type="dxa"/>
+              <w:end w:w="120" w:type="dxa"/>
+            </w:tcMar>
+            <w:vAlign w:val="center"/>
+          </w:tcPr>
+          <w:p>
+            <w:pPr>
+              <w:spacing w:before="0" w:after="20" w:line="259" w:lineRule="auto"/>
+            </w:pPr>
+            <w:r>
+              <w:rPr>
+                <w:rFonts w:ascii="Microsoft YaHei" w:hAnsi="Microsoft YaHei" w:eastAsia="Microsoft YaHei"/>
+                <w:color w:val="243447"/>
+                <w:sz w:val="17"/>
+              </w:rPr>
+            </w:r>
+            <w:r>
+              <w:rPr>
+                <w:rFonts w:ascii="Microsoft YaHei" w:hAnsi="Microsoft YaHei" w:eastAsia="Microsoft YaHei"/>
+                <w:b w:val="0"/>
+                <w:color w:val="243447"/>
+                <w:sz w:val="17"/>
+              </w:rPr>
+              <w:t>统一按处理前订单在左、处理后订单在右展示旺店通单号、关联OMS单据及商品数量。</w:t>
+            </w:r>
+          </w:p>
+        </w:tc>
+        <w:tc>
+          <w:tcPr>
+            <w:tcW w:type="dxa" w:w="2610"/>
+            <w:tcMar>
+              <w:top w:w="80" w:type="dxa"/>
+              <w:start w:w="120" w:type="dxa"/>
+              <w:bottom w:w="80" w:type="dxa"/>
+              <w:end w:w="120" w:type="dxa"/>
+            </w:tcMar>
+            <w:vAlign w:val="center"/>
+          </w:tcPr>
+          <w:p>
+            <w:pPr>
+              <w:spacing w:before="0" w:after="20" w:line="259" w:lineRule="auto"/>
+            </w:pPr>
+            <w:r>
+              <w:rPr>
+                <w:rFonts w:ascii="Microsoft YaHei" w:hAnsi="Microsoft YaHei" w:eastAsia="Microsoft YaHei"/>
+                <w:color w:val="243447"/>
+                <w:sz w:val="17"/>
+              </w:rPr>
+            </w:r>
+            <w:r>
+              <w:rPr>
+                <w:rFonts w:ascii="Microsoft YaHei" w:hAnsi="Microsoft YaHei" w:eastAsia="Microsoft YaHei"/>
+                <w:b w:val="0"/>
+                <w:color w:val="243447"/>
+                <w:sz w:val="17"/>
+              </w:rPr>
+              <w:t>拆/合单管理列表</w:t>
+            </w:r>
+          </w:p>
+        </w:tc>
+      </w:tr>
+      <w:tr>
+        <w:trPr>
+          <w:cantSplit/>
+        </w:trPr>
+        <w:tc>
+          <w:tcPr>
+            <w:tcW w:type="dxa" w:w="1750"/>
+            <w:tcMar>
+              <w:top w:w="80" w:type="dxa"/>
+              <w:start w:w="120" w:type="dxa"/>
+              <w:bottom w:w="80" w:type="dxa"/>
+              <w:end w:w="120" w:type="dxa"/>
+            </w:tcMar>
+            <w:vAlign w:val="center"/>
+          </w:tcPr>
+          <w:p>
+            <w:pPr>
+              <w:spacing w:before="0" w:after="20" w:line="259" w:lineRule="auto"/>
+            </w:pPr>
+            <w:r>
+              <w:rPr>
+                <w:rFonts w:ascii="Microsoft YaHei" w:hAnsi="Microsoft YaHei" w:eastAsia="Microsoft YaHei"/>
+                <w:color w:val="243447"/>
+                <w:sz w:val="17"/>
+              </w:rPr>
+            </w:r>
+            <w:r>
+              <w:rPr>
+                <w:rFonts w:ascii="Microsoft YaHei" w:hAnsi="Microsoft YaHei" w:eastAsia="Microsoft YaHei"/>
+                <w:b w:val="0"/>
+                <w:color w:val="243447"/>
+                <w:sz w:val="17"/>
+              </w:rPr>
               <w:t>查询能力</w:t>
             </w:r>
           </w:p>
@@ -2292,7 +2524,7 @@
           <w:color w:val="243447"/>
           <w:sz w:val="20"/>
         </w:rPr>
-        <w:t>不新增独立的旺店通拆合单管理列表或面向业务的待匹配Tab。</w:t>
+        <w:t>拆/合单管理不承载未匹配原始数据或技术异常处理，异常数据继续在后台任务与监控中处理。</w:t>
       </w:r>
     </w:p>
     <w:p>
@@ -2986,6 +3218,110 @@
                 <w:color w:val="243447"/>
                 <w:sz w:val="17"/>
               </w:rPr>
+              <w:t>拆/合单管理</w:t>
+            </w:r>
+          </w:p>
+        </w:tc>
+        <w:tc>
+          <w:tcPr>
+            <w:tcW w:type="dxa" w:w="5610"/>
+            <w:tcMar>
+              <w:top w:w="80" w:type="dxa"/>
+              <w:start w:w="120" w:type="dxa"/>
+              <w:bottom w:w="80" w:type="dxa"/>
+              <w:end w:w="120" w:type="dxa"/>
+            </w:tcMar>
+            <w:vAlign w:val="center"/>
+          </w:tcPr>
+          <w:p>
+            <w:pPr>
+              <w:spacing w:before="0" w:after="20" w:line="259" w:lineRule="auto"/>
+            </w:pPr>
+            <w:r>
+              <w:rPr>
+                <w:rFonts w:ascii="Microsoft YaHei" w:hAnsi="Microsoft YaHei" w:eastAsia="Microsoft YaHei"/>
+                <w:color w:val="243447"/>
+                <w:sz w:val="17"/>
+              </w:rPr>
+            </w:r>
+            <w:r>
+              <w:rPr>
+                <w:rFonts w:ascii="Microsoft YaHei" w:hAnsi="Microsoft YaHei" w:eastAsia="Microsoft YaHei"/>
+                <w:b w:val="0"/>
+                <w:color w:val="243447"/>
+                <w:sz w:val="17"/>
+              </w:rPr>
+              <w:t>可集中筛选拆单与合单记录，并展示处理前订单和处理后订单。</w:t>
+            </w:r>
+          </w:p>
+        </w:tc>
+      </w:tr>
+      <w:tr>
+        <w:trPr>
+          <w:cantSplit/>
+        </w:trPr>
+        <w:tc>
+          <w:tcPr>
+            <w:tcW w:type="dxa" w:w="900"/>
+            <w:tcMar>
+              <w:top w:w="80" w:type="dxa"/>
+              <w:start w:w="120" w:type="dxa"/>
+              <w:bottom w:w="80" w:type="dxa"/>
+              <w:end w:w="120" w:type="dxa"/>
+            </w:tcMar>
+            <w:vAlign w:val="center"/>
+          </w:tcPr>
+          <w:p>
+            <w:pPr>
+              <w:spacing w:before="0" w:after="20" w:line="259" w:lineRule="auto"/>
+            </w:pPr>
+            <w:r>
+              <w:rPr>
+                <w:rFonts w:ascii="Microsoft YaHei" w:hAnsi="Microsoft YaHei" w:eastAsia="Microsoft YaHei"/>
+                <w:color w:val="243447"/>
+                <w:sz w:val="17"/>
+              </w:rPr>
+            </w:r>
+            <w:r>
+              <w:rPr>
+                <w:rFonts w:ascii="Microsoft YaHei" w:hAnsi="Microsoft YaHei" w:eastAsia="Microsoft YaHei"/>
+                <w:b w:val="0"/>
+                <w:color w:val="243447"/>
+                <w:sz w:val="17"/>
+              </w:rPr>
+              <w:t>P0</w:t>
+            </w:r>
+          </w:p>
+        </w:tc>
+        <w:tc>
+          <w:tcPr>
+            <w:tcW w:type="dxa" w:w="2850"/>
+            <w:tcMar>
+              <w:top w:w="80" w:type="dxa"/>
+              <w:start w:w="120" w:type="dxa"/>
+              <w:bottom w:w="80" w:type="dxa"/>
+              <w:end w:w="120" w:type="dxa"/>
+            </w:tcMar>
+            <w:vAlign w:val="center"/>
+          </w:tcPr>
+          <w:p>
+            <w:pPr>
+              <w:spacing w:before="0" w:after="20" w:line="259" w:lineRule="auto"/>
+            </w:pPr>
+            <w:r>
+              <w:rPr>
+                <w:rFonts w:ascii="Microsoft YaHei" w:hAnsi="Microsoft YaHei" w:eastAsia="Microsoft YaHei"/>
+                <w:color w:val="243447"/>
+                <w:sz w:val="17"/>
+              </w:rPr>
+            </w:r>
+            <w:r>
+              <w:rPr>
+                <w:rFonts w:ascii="Microsoft YaHei" w:hAnsi="Microsoft YaHei" w:eastAsia="Microsoft YaHei"/>
+                <w:b w:val="0"/>
+                <w:color w:val="243447"/>
+                <w:sz w:val="17"/>
+              </w:rPr>
               <w:t>来源结果与数量展示</w:t>
             </w:r>
           </w:p>
@@ -3425,7 +3761,7 @@
         <w:drawing>
           <wp:inline xmlns:a="http://schemas.openxmlformats.org/drawingml/2006/main" xmlns:pic="http://schemas.openxmlformats.org/drawingml/2006/picture">
             <wp:extent cx="6080760" cy="2567432"/>
-            <wp:docPr id="2" name="Picture 2" title="发货管理主记录与拆合历史展示模型" descr="发货管理列表只有一条OMS发货单，拆单和合单仅在该发货单的记录弹窗中展示。"/>
+            <wp:docPr id="2" name="Picture 2" title="发货管理与拆合单管理双入口模型" descr="发货管理保持一条OMS主发货单，拆合单管理集中展示旺店通处理前后订单，两者共享关系数据。"/>
             <wp:cNvGraphicFramePr>
               <a:graphicFrameLocks noChangeAspect="1"/>
             </wp:cNvGraphicFramePr>
@@ -3468,7 +3804,7 @@
           <w:color w:val="667085"/>
           <w:sz w:val="18"/>
         </w:rPr>
-        <w:t>图2 发货管理主记录与拆合历史展示模型</w:t>
+        <w:t>图2 发货管理与拆合单管理双入口模型</w:t>
       </w:r>
     </w:p>
     <w:p>
@@ -3849,6 +4185,148 @@
                 <w:sz w:val="18"/>
               </w:rPr>
               <w:t>弹窗顶部先展示原始OMS发货单，再按时间顺序展示旺店通拆单与合单历史。</w:t>
+            </w:r>
+          </w:p>
+        </w:tc>
+      </w:tr>
+      <w:tr>
+        <w:trPr>
+          <w:cantSplit/>
+        </w:trPr>
+        <w:tc>
+          <w:tcPr>
+            <w:tcW w:type="dxa" w:w="2200"/>
+            <w:tcMar>
+              <w:top w:w="80" w:type="dxa"/>
+              <w:start w:w="120" w:type="dxa"/>
+              <w:bottom w:w="80" w:type="dxa"/>
+              <w:end w:w="120" w:type="dxa"/>
+            </w:tcMar>
+            <w:vAlign w:val="center"/>
+          </w:tcPr>
+          <w:p>
+            <w:pPr>
+              <w:spacing w:before="0" w:after="20" w:line="259" w:lineRule="auto"/>
+            </w:pPr>
+            <w:r>
+              <w:rPr>
+                <w:rFonts w:ascii="Microsoft YaHei" w:hAnsi="Microsoft YaHei" w:eastAsia="Microsoft YaHei"/>
+                <w:color w:val="243447"/>
+                <w:sz w:val="18"/>
+              </w:rPr>
+            </w:r>
+            <w:r>
+              <w:rPr>
+                <w:rFonts w:ascii="Microsoft YaHei" w:hAnsi="Microsoft YaHei" w:eastAsia="Microsoft YaHei"/>
+                <w:b w:val="0"/>
+                <w:color w:val="243447"/>
+                <w:sz w:val="18"/>
+              </w:rPr>
+              <w:t>拆/合单管理</w:t>
+            </w:r>
+          </w:p>
+        </w:tc>
+        <w:tc>
+          <w:tcPr>
+            <w:tcW w:type="dxa" w:w="7160"/>
+            <w:tcMar>
+              <w:top w:w="80" w:type="dxa"/>
+              <w:start w:w="120" w:type="dxa"/>
+              <w:bottom w:w="80" w:type="dxa"/>
+              <w:end w:w="120" w:type="dxa"/>
+            </w:tcMar>
+            <w:vAlign w:val="center"/>
+          </w:tcPr>
+          <w:p>
+            <w:pPr>
+              <w:spacing w:before="0" w:after="20" w:line="259" w:lineRule="auto"/>
+            </w:pPr>
+            <w:r>
+              <w:rPr>
+                <w:rFonts w:ascii="Microsoft YaHei" w:hAnsi="Microsoft YaHei" w:eastAsia="Microsoft YaHei"/>
+                <w:color w:val="243447"/>
+                <w:sz w:val="18"/>
+              </w:rPr>
+            </w:r>
+            <w:r>
+              <w:rPr>
+                <w:rFonts w:ascii="Microsoft YaHei" w:hAnsi="Microsoft YaHei" w:eastAsia="Microsoft YaHei"/>
+                <w:b w:val="0"/>
+                <w:color w:val="243447"/>
+                <w:sz w:val="18"/>
+              </w:rPr>
+              <w:t>独立菜单集中展示全部被拆合订单，提供全部记录、拆单记录、合单记录Tab。</w:t>
+            </w:r>
+          </w:p>
+        </w:tc>
+      </w:tr>
+      <w:tr>
+        <w:trPr>
+          <w:cantSplit/>
+        </w:trPr>
+        <w:tc>
+          <w:tcPr>
+            <w:tcW w:type="dxa" w:w="2200"/>
+            <w:tcMar>
+              <w:top w:w="80" w:type="dxa"/>
+              <w:start w:w="120" w:type="dxa"/>
+              <w:bottom w:w="80" w:type="dxa"/>
+              <w:end w:w="120" w:type="dxa"/>
+            </w:tcMar>
+            <w:vAlign w:val="center"/>
+          </w:tcPr>
+          <w:p>
+            <w:pPr>
+              <w:spacing w:before="0" w:after="20" w:line="259" w:lineRule="auto"/>
+            </w:pPr>
+            <w:r>
+              <w:rPr>
+                <w:rFonts w:ascii="Microsoft YaHei" w:hAnsi="Microsoft YaHei" w:eastAsia="Microsoft YaHei"/>
+                <w:color w:val="243447"/>
+                <w:sz w:val="18"/>
+              </w:rPr>
+            </w:r>
+            <w:r>
+              <w:rPr>
+                <w:rFonts w:ascii="Microsoft YaHei" w:hAnsi="Microsoft YaHei" w:eastAsia="Microsoft YaHei"/>
+                <w:b w:val="0"/>
+                <w:color w:val="243447"/>
+                <w:sz w:val="18"/>
+              </w:rPr>
+              <w:t>管理列表卡片</w:t>
+            </w:r>
+          </w:p>
+        </w:tc>
+        <w:tc>
+          <w:tcPr>
+            <w:tcW w:type="dxa" w:w="7160"/>
+            <w:tcMar>
+              <w:top w:w="80" w:type="dxa"/>
+              <w:start w:w="120" w:type="dxa"/>
+              <w:bottom w:w="80" w:type="dxa"/>
+              <w:end w:w="120" w:type="dxa"/>
+            </w:tcMar>
+            <w:vAlign w:val="center"/>
+          </w:tcPr>
+          <w:p>
+            <w:pPr>
+              <w:spacing w:before="0" w:after="20" w:line="259" w:lineRule="auto"/>
+            </w:pPr>
+            <w:r>
+              <w:rPr>
+                <w:rFonts w:ascii="Microsoft YaHei" w:hAnsi="Microsoft YaHei" w:eastAsia="Microsoft YaHei"/>
+                <w:color w:val="243447"/>
+                <w:sz w:val="18"/>
+              </w:rPr>
+            </w:r>
+            <w:r>
+              <w:rPr>
+                <w:rFonts w:ascii="Microsoft YaHei" w:hAnsi="Microsoft YaHei" w:eastAsia="Microsoft YaHei"/>
+                <w:b w:val="0"/>
+                <w:color w:val="243447"/>
+                <w:sz w:val="18"/>
+              </w:rPr>
+              <w:t>每条记录先展示处理前订单，再展示处理后订单，并标注关联OMS发货单和原订单。</w:t>
             </w:r>
           </w:p>
         </w:tc>
@@ -4555,7 +5033,7 @@
         <w:keepNext/>
       </w:pPr>
       <w:r>
-        <w:t>7.2 数据拉取与匹配规则</w:t>
+        <w:t>7.2 双入口展示规则</w:t>
       </w:r>
     </w:p>
     <w:tbl>
@@ -4607,7 +5085,7 @@
                 <w:color w:val="243447"/>
                 <w:sz w:val="17"/>
               </w:rPr>
-              <w:t>规则项</w:t>
+              <w:t>页面</w:t>
             </w:r>
           </w:p>
         </w:tc>
@@ -4642,7 +5120,7 @@
                 <w:color w:val="243447"/>
                 <w:sz w:val="17"/>
               </w:rPr>
-              <w:t>要求</w:t>
+              <w:t>展示口径</w:t>
             </w:r>
           </w:p>
         </w:tc>
@@ -4680,7 +5158,7 @@
                 <w:color w:val="243447"/>
                 <w:sz w:val="17"/>
               </w:rPr>
-              <w:t>权威数据源</w:t>
+              <w:t>发货管理</w:t>
             </w:r>
           </w:p>
         </w:tc>
@@ -4713,7 +5191,7 @@
                 <w:color w:val="243447"/>
                 <w:sz w:val="17"/>
               </w:rPr>
-              <w:t>旺店通拆合记录是执行结果的唯一权威来源，OMS不得自行推导或改写。</w:t>
+              <w:t>一张OMS原发货单只展示一条；拆合信息作为摘要和详情挂载，不增加结果行。</w:t>
             </w:r>
           </w:p>
         </w:tc>
@@ -4751,7 +5229,7 @@
                 <w:color w:val="243447"/>
                 <w:sz w:val="17"/>
               </w:rPr>
-              <w:t>触发方式</w:t>
+              <w:t>拆/合单管理</w:t>
             </w:r>
           </w:p>
         </w:tc>
@@ -4784,7 +5262,7 @@
                 <w:color w:val="243447"/>
                 <w:sz w:val="17"/>
               </w:rPr>
-              <w:t>后台定时增量拉取；发货管理可提供人工更新旺店通状态。两者共用游标和幂等规则。</w:t>
+              <w:t>一条旺店通拆合记录展示一条；集中展示被处理订单，不参与OMS发货单数量统计。</w:t>
             </w:r>
           </w:p>
         </w:tc>
@@ -4822,7 +5300,7 @@
                 <w:color w:val="243447"/>
                 <w:sz w:val="17"/>
               </w:rPr>
-              <w:t>增量游标</w:t>
+              <w:t>拆单记录</w:t>
             </w:r>
           </w:p>
         </w:tc>
@@ -4855,7 +5333,7 @@
                 <w:color w:val="243447"/>
                 <w:sz w:val="17"/>
               </w:rPr>
-              <w:t>使用旺店通更新时间与记录唯一ID组合推进水位，避免同一时间多条记录遗漏。</w:t>
+              <w:t>先展示一张处理前来源单及原商品数量，再展示多张处理后结果单及分配数量。</w:t>
             </w:r>
           </w:p>
         </w:tc>
@@ -4893,7 +5371,7 @@
                 <w:color w:val="243447"/>
                 <w:sz w:val="17"/>
               </w:rPr>
-              <w:t>主记录匹配</w:t>
+              <w:t>合单记录</w:t>
             </w:r>
           </w:p>
         </w:tc>
@@ -4926,7 +5404,7 @@
                 <w:color w:val="243447"/>
                 <w:sz w:val="17"/>
               </w:rPr>
-              <w:t>优先使用OMS发货单唯一ID、原同步请求号或既有旺店通原单映射定位原发货单。</w:t>
+              <w:t>先展示多张处理前来源单及各自商品数量，再展示一张处理后合并结果单。</w:t>
             </w:r>
           </w:p>
         </w:tc>
@@ -4964,7 +5442,7 @@
                 <w:color w:val="243447"/>
                 <w:sz w:val="17"/>
               </w:rPr>
-              <w:t>幂等写入</w:t>
+              <w:t>跨页追溯</w:t>
             </w:r>
           </w:p>
         </w:tc>
@@ -4997,7 +5475,7 @@
                 <w:color w:val="243447"/>
                 <w:sz w:val="17"/>
               </w:rPr>
-              <w:t>同一旺店通拆合记录重复返回时更新原历史，不重复挂载。</w:t>
+              <w:t>从发货管理可进入该发货单记录；从拆/合单管理可反查所有关联OMS发货单。</w:t>
             </w:r>
           </w:p>
         </w:tc>
@@ -5035,7 +5513,7 @@
                 <w:color w:val="243447"/>
                 <w:sz w:val="17"/>
               </w:rPr>
-              <w:t>匹配失败</w:t>
+              <w:t>数据一致性</w:t>
             </w:r>
           </w:p>
         </w:tc>
@@ -5068,7 +5546,106 @@
                 <w:color w:val="243447"/>
                 <w:sz w:val="17"/>
               </w:rPr>
-              <w:t>保存原始数据并进入后台异常处理；不在发货管理创建临时或孤立发货单。</w:t>
+              <w:t>两个页面共享同一关系ID和更新时间，不复制生成两套业务记录。</w:t>
+            </w:r>
+          </w:p>
+        </w:tc>
+      </w:tr>
+    </w:tbl>
+    <w:p>
+      <w:pPr>
+        <w:pStyle w:val="Heading2"/>
+        <w:keepNext/>
+      </w:pPr>
+      <w:r>
+        <w:t>7.3 数据拉取与匹配规则</w:t>
+      </w:r>
+    </w:p>
+    <w:tbl>
+      <w:tblPr>
+        <w:tblStyle w:val="TableGrid"/>
+        <w:tblW w:type="dxa" w:w="9360"/>
+        <w:jc w:val="left"/>
+        <w:tblLayout w:type="fixed"/>
+        <w:tblLook w:firstColumn="1" w:firstRow="1" w:lastColumn="0" w:lastRow="0" w:noHBand="0" w:noVBand="1" w:val="04A0"/>
+        <w:tblInd w:w="120" w:type="dxa"/>
+      </w:tblPr>
+      <w:tblGrid>
+        <w:gridCol w:w="2200"/>
+        <w:gridCol w:w="7160"/>
+      </w:tblGrid>
+      <w:tr>
+        <w:trPr>
+          <w:cantSplit/>
+          <w:tblHeader w:val="true"/>
+        </w:trPr>
+        <w:tc>
+          <w:tcPr>
+            <w:tcW w:type="dxa" w:w="2200"/>
+            <w:tcMar>
+              <w:top w:w="80" w:type="dxa"/>
+              <w:start w:w="120" w:type="dxa"/>
+              <w:bottom w:w="80" w:type="dxa"/>
+              <w:end w:w="120" w:type="dxa"/>
+            </w:tcMar>
+            <w:vAlign w:val="center"/>
+            <w:shd w:fill="F2F4F7"/>
+          </w:tcPr>
+          <w:p>
+            <w:pPr>
+              <w:spacing w:before="0" w:after="20" w:line="259" w:lineRule="auto"/>
+            </w:pPr>
+            <w:r>
+              <w:rPr>
+                <w:rFonts w:ascii="Microsoft YaHei" w:hAnsi="Microsoft YaHei" w:eastAsia="Microsoft YaHei"/>
+                <w:b/>
+                <w:color w:val="243447"/>
+                <w:sz w:val="17"/>
+              </w:rPr>
+            </w:r>
+            <w:r>
+              <w:rPr>
+                <w:rFonts w:ascii="Microsoft YaHei" w:hAnsi="Microsoft YaHei" w:eastAsia="Microsoft YaHei"/>
+                <w:b/>
+                <w:color w:val="243447"/>
+                <w:sz w:val="17"/>
+              </w:rPr>
+              <w:t>规则项</w:t>
+            </w:r>
+          </w:p>
+        </w:tc>
+        <w:tc>
+          <w:tcPr>
+            <w:tcW w:type="dxa" w:w="7160"/>
+            <w:tcMar>
+              <w:top w:w="80" w:type="dxa"/>
+              <w:start w:w="120" w:type="dxa"/>
+              <w:bottom w:w="80" w:type="dxa"/>
+              <w:end w:w="120" w:type="dxa"/>
+            </w:tcMar>
+            <w:vAlign w:val="center"/>
+            <w:shd w:fill="F2F4F7"/>
+          </w:tcPr>
+          <w:p>
+            <w:pPr>
+              <w:spacing w:before="0" w:after="20" w:line="259" w:lineRule="auto"/>
+            </w:pPr>
+            <w:r>
+              <w:rPr>
+                <w:rFonts w:ascii="Microsoft YaHei" w:hAnsi="Microsoft YaHei" w:eastAsia="Microsoft YaHei"/>
+                <w:b/>
+                <w:color w:val="243447"/>
+                <w:sz w:val="17"/>
+              </w:rPr>
+            </w:r>
+            <w:r>
+              <w:rPr>
+                <w:rFonts w:ascii="Microsoft YaHei" w:hAnsi="Microsoft YaHei" w:eastAsia="Microsoft YaHei"/>
+                <w:b/>
+                <w:color w:val="243447"/>
+                <w:sz w:val="17"/>
+              </w:rPr>
+              <w:t>要求</w:t>
             </w:r>
           </w:p>
         </w:tc>
@@ -5106,7 +5683,7 @@
                 <w:color w:val="243447"/>
                 <w:sz w:val="17"/>
               </w:rPr>
-              <w:t>只读边界</w:t>
+              <w:t>权威数据源</w:t>
             </w:r>
           </w:p>
         </w:tc>
@@ -5139,6 +5716,432 @@
                 <w:color w:val="243447"/>
                 <w:sz w:val="17"/>
               </w:rPr>
+              <w:t>旺店通拆合记录是执行结果的唯一权威来源，OMS不得自行推导或改写。</w:t>
+            </w:r>
+          </w:p>
+        </w:tc>
+      </w:tr>
+      <w:tr>
+        <w:trPr>
+          <w:cantSplit/>
+        </w:trPr>
+        <w:tc>
+          <w:tcPr>
+            <w:tcW w:type="dxa" w:w="2200"/>
+            <w:tcMar>
+              <w:top w:w="80" w:type="dxa"/>
+              <w:start w:w="120" w:type="dxa"/>
+              <w:bottom w:w="80" w:type="dxa"/>
+              <w:end w:w="120" w:type="dxa"/>
+            </w:tcMar>
+            <w:vAlign w:val="center"/>
+          </w:tcPr>
+          <w:p>
+            <w:pPr>
+              <w:spacing w:before="0" w:after="20" w:line="259" w:lineRule="auto"/>
+            </w:pPr>
+            <w:r>
+              <w:rPr>
+                <w:rFonts w:ascii="Microsoft YaHei" w:hAnsi="Microsoft YaHei" w:eastAsia="Microsoft YaHei"/>
+                <w:color w:val="243447"/>
+                <w:sz w:val="17"/>
+              </w:rPr>
+            </w:r>
+            <w:r>
+              <w:rPr>
+                <w:rFonts w:ascii="Microsoft YaHei" w:hAnsi="Microsoft YaHei" w:eastAsia="Microsoft YaHei"/>
+                <w:b w:val="0"/>
+                <w:color w:val="243447"/>
+                <w:sz w:val="17"/>
+              </w:rPr>
+              <w:t>触发方式</w:t>
+            </w:r>
+          </w:p>
+        </w:tc>
+        <w:tc>
+          <w:tcPr>
+            <w:tcW w:type="dxa" w:w="7160"/>
+            <w:tcMar>
+              <w:top w:w="80" w:type="dxa"/>
+              <w:start w:w="120" w:type="dxa"/>
+              <w:bottom w:w="80" w:type="dxa"/>
+              <w:end w:w="120" w:type="dxa"/>
+            </w:tcMar>
+            <w:vAlign w:val="center"/>
+          </w:tcPr>
+          <w:p>
+            <w:pPr>
+              <w:spacing w:before="0" w:after="20" w:line="259" w:lineRule="auto"/>
+            </w:pPr>
+            <w:r>
+              <w:rPr>
+                <w:rFonts w:ascii="Microsoft YaHei" w:hAnsi="Microsoft YaHei" w:eastAsia="Microsoft YaHei"/>
+                <w:color w:val="243447"/>
+                <w:sz w:val="17"/>
+              </w:rPr>
+            </w:r>
+            <w:r>
+              <w:rPr>
+                <w:rFonts w:ascii="Microsoft YaHei" w:hAnsi="Microsoft YaHei" w:eastAsia="Microsoft YaHei"/>
+                <w:b w:val="0"/>
+                <w:color w:val="243447"/>
+                <w:sz w:val="17"/>
+              </w:rPr>
+              <w:t>后台定时增量拉取；发货管理可提供人工更新旺店通状态。两者共用游标和幂等规则。</w:t>
+            </w:r>
+          </w:p>
+        </w:tc>
+      </w:tr>
+      <w:tr>
+        <w:trPr>
+          <w:cantSplit/>
+        </w:trPr>
+        <w:tc>
+          <w:tcPr>
+            <w:tcW w:type="dxa" w:w="2200"/>
+            <w:tcMar>
+              <w:top w:w="80" w:type="dxa"/>
+              <w:start w:w="120" w:type="dxa"/>
+              <w:bottom w:w="80" w:type="dxa"/>
+              <w:end w:w="120" w:type="dxa"/>
+            </w:tcMar>
+            <w:vAlign w:val="center"/>
+          </w:tcPr>
+          <w:p>
+            <w:pPr>
+              <w:spacing w:before="0" w:after="20" w:line="259" w:lineRule="auto"/>
+            </w:pPr>
+            <w:r>
+              <w:rPr>
+                <w:rFonts w:ascii="Microsoft YaHei" w:hAnsi="Microsoft YaHei" w:eastAsia="Microsoft YaHei"/>
+                <w:color w:val="243447"/>
+                <w:sz w:val="17"/>
+              </w:rPr>
+            </w:r>
+            <w:r>
+              <w:rPr>
+                <w:rFonts w:ascii="Microsoft YaHei" w:hAnsi="Microsoft YaHei" w:eastAsia="Microsoft YaHei"/>
+                <w:b w:val="0"/>
+                <w:color w:val="243447"/>
+                <w:sz w:val="17"/>
+              </w:rPr>
+              <w:t>增量游标</w:t>
+            </w:r>
+          </w:p>
+        </w:tc>
+        <w:tc>
+          <w:tcPr>
+            <w:tcW w:type="dxa" w:w="7160"/>
+            <w:tcMar>
+              <w:top w:w="80" w:type="dxa"/>
+              <w:start w:w="120" w:type="dxa"/>
+              <w:bottom w:w="80" w:type="dxa"/>
+              <w:end w:w="120" w:type="dxa"/>
+            </w:tcMar>
+            <w:vAlign w:val="center"/>
+          </w:tcPr>
+          <w:p>
+            <w:pPr>
+              <w:spacing w:before="0" w:after="20" w:line="259" w:lineRule="auto"/>
+            </w:pPr>
+            <w:r>
+              <w:rPr>
+                <w:rFonts w:ascii="Microsoft YaHei" w:hAnsi="Microsoft YaHei" w:eastAsia="Microsoft YaHei"/>
+                <w:color w:val="243447"/>
+                <w:sz w:val="17"/>
+              </w:rPr>
+            </w:r>
+            <w:r>
+              <w:rPr>
+                <w:rFonts w:ascii="Microsoft YaHei" w:hAnsi="Microsoft YaHei" w:eastAsia="Microsoft YaHei"/>
+                <w:b w:val="0"/>
+                <w:color w:val="243447"/>
+                <w:sz w:val="17"/>
+              </w:rPr>
+              <w:t>使用旺店通更新时间与记录唯一ID组合推进水位，避免同一时间多条记录遗漏。</w:t>
+            </w:r>
+          </w:p>
+        </w:tc>
+      </w:tr>
+      <w:tr>
+        <w:trPr>
+          <w:cantSplit/>
+        </w:trPr>
+        <w:tc>
+          <w:tcPr>
+            <w:tcW w:type="dxa" w:w="2200"/>
+            <w:tcMar>
+              <w:top w:w="80" w:type="dxa"/>
+              <w:start w:w="120" w:type="dxa"/>
+              <w:bottom w:w="80" w:type="dxa"/>
+              <w:end w:w="120" w:type="dxa"/>
+            </w:tcMar>
+            <w:vAlign w:val="center"/>
+          </w:tcPr>
+          <w:p>
+            <w:pPr>
+              <w:spacing w:before="0" w:after="20" w:line="259" w:lineRule="auto"/>
+            </w:pPr>
+            <w:r>
+              <w:rPr>
+                <w:rFonts w:ascii="Microsoft YaHei" w:hAnsi="Microsoft YaHei" w:eastAsia="Microsoft YaHei"/>
+                <w:color w:val="243447"/>
+                <w:sz w:val="17"/>
+              </w:rPr>
+            </w:r>
+            <w:r>
+              <w:rPr>
+                <w:rFonts w:ascii="Microsoft YaHei" w:hAnsi="Microsoft YaHei" w:eastAsia="Microsoft YaHei"/>
+                <w:b w:val="0"/>
+                <w:color w:val="243447"/>
+                <w:sz w:val="17"/>
+              </w:rPr>
+              <w:t>主记录匹配</w:t>
+            </w:r>
+          </w:p>
+        </w:tc>
+        <w:tc>
+          <w:tcPr>
+            <w:tcW w:type="dxa" w:w="7160"/>
+            <w:tcMar>
+              <w:top w:w="80" w:type="dxa"/>
+              <w:start w:w="120" w:type="dxa"/>
+              <w:bottom w:w="80" w:type="dxa"/>
+              <w:end w:w="120" w:type="dxa"/>
+            </w:tcMar>
+            <w:vAlign w:val="center"/>
+          </w:tcPr>
+          <w:p>
+            <w:pPr>
+              <w:spacing w:before="0" w:after="20" w:line="259" w:lineRule="auto"/>
+            </w:pPr>
+            <w:r>
+              <w:rPr>
+                <w:rFonts w:ascii="Microsoft YaHei" w:hAnsi="Microsoft YaHei" w:eastAsia="Microsoft YaHei"/>
+                <w:color w:val="243447"/>
+                <w:sz w:val="17"/>
+              </w:rPr>
+            </w:r>
+            <w:r>
+              <w:rPr>
+                <w:rFonts w:ascii="Microsoft YaHei" w:hAnsi="Microsoft YaHei" w:eastAsia="Microsoft YaHei"/>
+                <w:b w:val="0"/>
+                <w:color w:val="243447"/>
+                <w:sz w:val="17"/>
+              </w:rPr>
+              <w:t>优先使用OMS发货单唯一ID、原同步请求号或既有旺店通原单映射定位原发货单。</w:t>
+            </w:r>
+          </w:p>
+        </w:tc>
+      </w:tr>
+      <w:tr>
+        <w:trPr>
+          <w:cantSplit/>
+        </w:trPr>
+        <w:tc>
+          <w:tcPr>
+            <w:tcW w:type="dxa" w:w="2200"/>
+            <w:tcMar>
+              <w:top w:w="80" w:type="dxa"/>
+              <w:start w:w="120" w:type="dxa"/>
+              <w:bottom w:w="80" w:type="dxa"/>
+              <w:end w:w="120" w:type="dxa"/>
+            </w:tcMar>
+            <w:vAlign w:val="center"/>
+          </w:tcPr>
+          <w:p>
+            <w:pPr>
+              <w:spacing w:before="0" w:after="20" w:line="259" w:lineRule="auto"/>
+            </w:pPr>
+            <w:r>
+              <w:rPr>
+                <w:rFonts w:ascii="Microsoft YaHei" w:hAnsi="Microsoft YaHei" w:eastAsia="Microsoft YaHei"/>
+                <w:color w:val="243447"/>
+                <w:sz w:val="17"/>
+              </w:rPr>
+            </w:r>
+            <w:r>
+              <w:rPr>
+                <w:rFonts w:ascii="Microsoft YaHei" w:hAnsi="Microsoft YaHei" w:eastAsia="Microsoft YaHei"/>
+                <w:b w:val="0"/>
+                <w:color w:val="243447"/>
+                <w:sz w:val="17"/>
+              </w:rPr>
+              <w:t>幂等写入</w:t>
+            </w:r>
+          </w:p>
+        </w:tc>
+        <w:tc>
+          <w:tcPr>
+            <w:tcW w:type="dxa" w:w="7160"/>
+            <w:tcMar>
+              <w:top w:w="80" w:type="dxa"/>
+              <w:start w:w="120" w:type="dxa"/>
+              <w:bottom w:w="80" w:type="dxa"/>
+              <w:end w:w="120" w:type="dxa"/>
+            </w:tcMar>
+            <w:vAlign w:val="center"/>
+          </w:tcPr>
+          <w:p>
+            <w:pPr>
+              <w:spacing w:before="0" w:after="20" w:line="259" w:lineRule="auto"/>
+            </w:pPr>
+            <w:r>
+              <w:rPr>
+                <w:rFonts w:ascii="Microsoft YaHei" w:hAnsi="Microsoft YaHei" w:eastAsia="Microsoft YaHei"/>
+                <w:color w:val="243447"/>
+                <w:sz w:val="17"/>
+              </w:rPr>
+            </w:r>
+            <w:r>
+              <w:rPr>
+                <w:rFonts w:ascii="Microsoft YaHei" w:hAnsi="Microsoft YaHei" w:eastAsia="Microsoft YaHei"/>
+                <w:b w:val="0"/>
+                <w:color w:val="243447"/>
+                <w:sz w:val="17"/>
+              </w:rPr>
+              <w:t>同一旺店通拆合记录重复返回时更新原历史，不重复挂载。</w:t>
+            </w:r>
+          </w:p>
+        </w:tc>
+      </w:tr>
+      <w:tr>
+        <w:trPr>
+          <w:cantSplit/>
+        </w:trPr>
+        <w:tc>
+          <w:tcPr>
+            <w:tcW w:type="dxa" w:w="2200"/>
+            <w:tcMar>
+              <w:top w:w="80" w:type="dxa"/>
+              <w:start w:w="120" w:type="dxa"/>
+              <w:bottom w:w="80" w:type="dxa"/>
+              <w:end w:w="120" w:type="dxa"/>
+            </w:tcMar>
+            <w:vAlign w:val="center"/>
+          </w:tcPr>
+          <w:p>
+            <w:pPr>
+              <w:spacing w:before="0" w:after="20" w:line="259" w:lineRule="auto"/>
+            </w:pPr>
+            <w:r>
+              <w:rPr>
+                <w:rFonts w:ascii="Microsoft YaHei" w:hAnsi="Microsoft YaHei" w:eastAsia="Microsoft YaHei"/>
+                <w:color w:val="243447"/>
+                <w:sz w:val="17"/>
+              </w:rPr>
+            </w:r>
+            <w:r>
+              <w:rPr>
+                <w:rFonts w:ascii="Microsoft YaHei" w:hAnsi="Microsoft YaHei" w:eastAsia="Microsoft YaHei"/>
+                <w:b w:val="0"/>
+                <w:color w:val="243447"/>
+                <w:sz w:val="17"/>
+              </w:rPr>
+              <w:t>匹配失败</w:t>
+            </w:r>
+          </w:p>
+        </w:tc>
+        <w:tc>
+          <w:tcPr>
+            <w:tcW w:type="dxa" w:w="7160"/>
+            <w:tcMar>
+              <w:top w:w="80" w:type="dxa"/>
+              <w:start w:w="120" w:type="dxa"/>
+              <w:bottom w:w="80" w:type="dxa"/>
+              <w:end w:w="120" w:type="dxa"/>
+            </w:tcMar>
+            <w:vAlign w:val="center"/>
+          </w:tcPr>
+          <w:p>
+            <w:pPr>
+              <w:spacing w:before="0" w:after="20" w:line="259" w:lineRule="auto"/>
+            </w:pPr>
+            <w:r>
+              <w:rPr>
+                <w:rFonts w:ascii="Microsoft YaHei" w:hAnsi="Microsoft YaHei" w:eastAsia="Microsoft YaHei"/>
+                <w:color w:val="243447"/>
+                <w:sz w:val="17"/>
+              </w:rPr>
+            </w:r>
+            <w:r>
+              <w:rPr>
+                <w:rFonts w:ascii="Microsoft YaHei" w:hAnsi="Microsoft YaHei" w:eastAsia="Microsoft YaHei"/>
+                <w:b w:val="0"/>
+                <w:color w:val="243447"/>
+                <w:sz w:val="17"/>
+              </w:rPr>
+              <w:t>保存原始数据并进入后台异常处理；不在发货管理创建临时或孤立发货单。</w:t>
+            </w:r>
+          </w:p>
+        </w:tc>
+      </w:tr>
+      <w:tr>
+        <w:trPr>
+          <w:cantSplit/>
+        </w:trPr>
+        <w:tc>
+          <w:tcPr>
+            <w:tcW w:type="dxa" w:w="2200"/>
+            <w:tcMar>
+              <w:top w:w="80" w:type="dxa"/>
+              <w:start w:w="120" w:type="dxa"/>
+              <w:bottom w:w="80" w:type="dxa"/>
+              <w:end w:w="120" w:type="dxa"/>
+            </w:tcMar>
+            <w:vAlign w:val="center"/>
+          </w:tcPr>
+          <w:p>
+            <w:pPr>
+              <w:spacing w:before="0" w:after="20" w:line="259" w:lineRule="auto"/>
+            </w:pPr>
+            <w:r>
+              <w:rPr>
+                <w:rFonts w:ascii="Microsoft YaHei" w:hAnsi="Microsoft YaHei" w:eastAsia="Microsoft YaHei"/>
+                <w:color w:val="243447"/>
+                <w:sz w:val="17"/>
+              </w:rPr>
+            </w:r>
+            <w:r>
+              <w:rPr>
+                <w:rFonts w:ascii="Microsoft YaHei" w:hAnsi="Microsoft YaHei" w:eastAsia="Microsoft YaHei"/>
+                <w:b w:val="0"/>
+                <w:color w:val="243447"/>
+                <w:sz w:val="17"/>
+              </w:rPr>
+              <w:t>只读边界</w:t>
+            </w:r>
+          </w:p>
+        </w:tc>
+        <w:tc>
+          <w:tcPr>
+            <w:tcW w:type="dxa" w:w="7160"/>
+            <w:tcMar>
+              <w:top w:w="80" w:type="dxa"/>
+              <w:start w:w="120" w:type="dxa"/>
+              <w:bottom w:w="80" w:type="dxa"/>
+              <w:end w:w="120" w:type="dxa"/>
+            </w:tcMar>
+            <w:vAlign w:val="center"/>
+          </w:tcPr>
+          <w:p>
+            <w:pPr>
+              <w:spacing w:before="0" w:after="20" w:line="259" w:lineRule="auto"/>
+            </w:pPr>
+            <w:r>
+              <w:rPr>
+                <w:rFonts w:ascii="Microsoft YaHei" w:hAnsi="Microsoft YaHei" w:eastAsia="Microsoft YaHei"/>
+                <w:color w:val="243447"/>
+                <w:sz w:val="17"/>
+              </w:rPr>
+            </w:r>
+            <w:r>
+              <w:rPr>
+                <w:rFonts w:ascii="Microsoft YaHei" w:hAnsi="Microsoft YaHei" w:eastAsia="Microsoft YaHei"/>
+                <w:b w:val="0"/>
+                <w:color w:val="243447"/>
+                <w:sz w:val="17"/>
+              </w:rPr>
               <w:t>OMS拉取任务不向旺店通写入拆合数据，也不触发重新拆合。</w:t>
             </w:r>
           </w:p>
@@ -5151,7 +6154,7 @@
         <w:keepNext/>
       </w:pPr>
       <w:r>
-        <w:t>7.3 关系与数量规则</w:t>
+        <w:t>7.4 关系与数量规则</w:t>
       </w:r>
     </w:p>
     <w:p>
@@ -5235,7 +6238,7 @@
         <w:keepNext/>
       </w:pPr>
       <w:r>
-        <w:t>7.4 状态与权限</w:t>
+        <w:t>7.5 状态与权限</w:t>
       </w:r>
     </w:p>
     <w:tbl>
@@ -5607,6 +6610,77 @@
                 <w:sz w:val="17"/>
               </w:rPr>
               <w:t>具备发货管理查询权限的人员可查看，但不能编辑旺店通记录和数量。</w:t>
+            </w:r>
+          </w:p>
+        </w:tc>
+      </w:tr>
+      <w:tr>
+        <w:trPr>
+          <w:cantSplit/>
+        </w:trPr>
+        <w:tc>
+          <w:tcPr>
+            <w:tcW w:type="dxa" w:w="2200"/>
+            <w:tcMar>
+              <w:top w:w="80" w:type="dxa"/>
+              <w:start w:w="120" w:type="dxa"/>
+              <w:bottom w:w="80" w:type="dxa"/>
+              <w:end w:w="120" w:type="dxa"/>
+            </w:tcMar>
+            <w:vAlign w:val="center"/>
+          </w:tcPr>
+          <w:p>
+            <w:pPr>
+              <w:spacing w:before="0" w:after="20" w:line="259" w:lineRule="auto"/>
+            </w:pPr>
+            <w:r>
+              <w:rPr>
+                <w:rFonts w:ascii="Microsoft YaHei" w:hAnsi="Microsoft YaHei" w:eastAsia="Microsoft YaHei"/>
+                <w:color w:val="243447"/>
+                <w:sz w:val="17"/>
+              </w:rPr>
+            </w:r>
+            <w:r>
+              <w:rPr>
+                <w:rFonts w:ascii="Microsoft YaHei" w:hAnsi="Microsoft YaHei" w:eastAsia="Microsoft YaHei"/>
+                <w:b w:val="0"/>
+                <w:color w:val="243447"/>
+                <w:sz w:val="17"/>
+              </w:rPr>
+              <w:t>拆/合单管理</w:t>
+            </w:r>
+          </w:p>
+        </w:tc>
+        <w:tc>
+          <w:tcPr>
+            <w:tcW w:type="dxa" w:w="7160"/>
+            <w:tcMar>
+              <w:top w:w="80" w:type="dxa"/>
+              <w:start w:w="120" w:type="dxa"/>
+              <w:bottom w:w="80" w:type="dxa"/>
+              <w:end w:w="120" w:type="dxa"/>
+            </w:tcMar>
+            <w:vAlign w:val="center"/>
+          </w:tcPr>
+          <w:p>
+            <w:pPr>
+              <w:spacing w:before="0" w:after="20" w:line="259" w:lineRule="auto"/>
+            </w:pPr>
+            <w:r>
+              <w:rPr>
+                <w:rFonts w:ascii="Microsoft YaHei" w:hAnsi="Microsoft YaHei" w:eastAsia="Microsoft YaHei"/>
+                <w:color w:val="243447"/>
+                <w:sz w:val="17"/>
+              </w:rPr>
+            </w:r>
+            <w:r>
+              <w:rPr>
+                <w:rFonts w:ascii="Microsoft YaHei" w:hAnsi="Microsoft YaHei" w:eastAsia="Microsoft YaHei"/>
+                <w:b w:val="0"/>
+                <w:color w:val="243447"/>
+                <w:sz w:val="17"/>
+              </w:rPr>
+              <w:t>具备拆合记录查询权限的人员可查看和导出，不提供编辑、删除或重新拆合。</w:t>
             </w:r>
           </w:p>
         </w:tc>
@@ -6872,6 +7946,21 @@
           <w:color w:val="243447"/>
           <w:sz w:val="20"/>
         </w:rPr>
+        <w:t>需要集中核对时，业务人员进入拆/合单管理查询所有被拆合订单和处理结果。</w:t>
+      </w:r>
+    </w:p>
+    <w:p>
+      <w:pPr>
+        <w:pStyle w:val="ListBullet"/>
+        <w:spacing w:after="80" w:line="280" w:lineRule="auto"/>
+        <w:ind w:left="720" w:hanging="360"/>
+      </w:pPr>
+      <w:r>
+        <w:rPr>
+          <w:rFonts w:ascii="Microsoft YaHei" w:hAnsi="Microsoft YaHei" w:eastAsia="Microsoft YaHei"/>
+          <w:color w:val="243447"/>
+          <w:sz w:val="20"/>
+        </w:rPr>
         <w:t>发货管理列表、统计和导出口径继续按OMS原发货单计算，不能按旺店通结果单增加记录数。</w:t>
       </w:r>
     </w:p>
@@ -7268,6 +8357,77 @@
                 <w:sz w:val="17"/>
               </w:rPr>
               <w:t>增加只读拆合时间线，先展示原记录，再展示旺店通处理结果。</w:t>
+            </w:r>
+          </w:p>
+        </w:tc>
+      </w:tr>
+      <w:tr>
+        <w:trPr>
+          <w:cantSplit/>
+        </w:trPr>
+        <w:tc>
+          <w:tcPr>
+            <w:tcW w:type="dxa" w:w="2300"/>
+            <w:tcMar>
+              <w:top w:w="80" w:type="dxa"/>
+              <w:start w:w="120" w:type="dxa"/>
+              <w:bottom w:w="80" w:type="dxa"/>
+              <w:end w:w="120" w:type="dxa"/>
+            </w:tcMar>
+            <w:vAlign w:val="center"/>
+          </w:tcPr>
+          <w:p>
+            <w:pPr>
+              <w:spacing w:before="0" w:after="20" w:line="259" w:lineRule="auto"/>
+            </w:pPr>
+            <w:r>
+              <w:rPr>
+                <w:rFonts w:ascii="Microsoft YaHei" w:hAnsi="Microsoft YaHei" w:eastAsia="Microsoft YaHei"/>
+                <w:color w:val="243447"/>
+                <w:sz w:val="17"/>
+              </w:rPr>
+            </w:r>
+            <w:r>
+              <w:rPr>
+                <w:rFonts w:ascii="Microsoft YaHei" w:hAnsi="Microsoft YaHei" w:eastAsia="Microsoft YaHei"/>
+                <w:b w:val="0"/>
+                <w:color w:val="243447"/>
+                <w:sz w:val="17"/>
+              </w:rPr>
+              <w:t>拆/合单管理</w:t>
+            </w:r>
+          </w:p>
+        </w:tc>
+        <w:tc>
+          <w:tcPr>
+            <w:tcW w:type="dxa" w:w="7060"/>
+            <w:tcMar>
+              <w:top w:w="80" w:type="dxa"/>
+              <w:start w:w="120" w:type="dxa"/>
+              <w:bottom w:w="80" w:type="dxa"/>
+              <w:end w:w="120" w:type="dxa"/>
+            </w:tcMar>
+            <w:vAlign w:val="center"/>
+          </w:tcPr>
+          <w:p>
+            <w:pPr>
+              <w:spacing w:before="0" w:after="20" w:line="259" w:lineRule="auto"/>
+            </w:pPr>
+            <w:r>
+              <w:rPr>
+                <w:rFonts w:ascii="Microsoft YaHei" w:hAnsi="Microsoft YaHei" w:eastAsia="Microsoft YaHei"/>
+                <w:color w:val="243447"/>
+                <w:sz w:val="17"/>
+              </w:rPr>
+            </w:r>
+            <w:r>
+              <w:rPr>
+                <w:rFonts w:ascii="Microsoft YaHei" w:hAnsi="Microsoft YaHei" w:eastAsia="Microsoft YaHei"/>
+                <w:b w:val="0"/>
+                <w:color w:val="243447"/>
+                <w:sz w:val="17"/>
+              </w:rPr>
+              <w:t>新增独立菜单、筛选、拆单与合单Tab、处理前后订单卡片和详情入口。</w:t>
             </w:r>
           </w:p>
         </w:tc>
@@ -8085,7 +9245,7 @@
                 <w:color w:val="243447"/>
                 <w:sz w:val="16"/>
               </w:rPr>
-              <w:t>发货管理改造</w:t>
+              <w:t>双入口页面改造</w:t>
             </w:r>
           </w:p>
         </w:tc>
@@ -8118,7 +9278,7 @@
                 <w:color w:val="243447"/>
                 <w:sz w:val="16"/>
               </w:rPr>
-              <w:t>保持原列表一条主记录，增加拆合摘要、查询、详情时间线及更新反馈。</w:t>
+              <w:t>发货管理保持一条主记录并增加详情；拆/合单管理实现筛选、Tab、处理前后订单卡片。</w:t>
             </w:r>
           </w:p>
         </w:tc>

</xml_diff>